<commit_message>
Add Section 4 Business Insights skeleton with placeholders
</commit_message>
<xml_diff>
--- a/Final Project/report/Executive Summary - Version 1 (04.30.26).docx
+++ b/Final Project/report/Executive Summary - Version 1 (04.30.26).docx
@@ -1115,6 +1115,1190 @@
           <w14:ligatures w14:val="none"/>
         </w:rPr>
         <w:t>. The Spark Structured Streaming consumer reads this topic, applies a one-minute tumbling window, and emits real-time aggregations such as concurrent viewers per content title and instantaneous buffering rates.</w:t>
+      </w:r>
+    </w:p>
+    <w:p>
+      <w:pPr>
+        <w:spacing w:before="100" w:beforeAutospacing="1" w:after="100" w:afterAutospacing="1" w:line="240" w:lineRule="auto"/>
+        <w:outlineLvl w:val="3"/>
+        <w:rPr>
+          <w:rFonts w:ascii="Times New Roman" w:eastAsia="Times New Roman" w:hAnsi="Times New Roman" w:cs="Times New Roman"/>
+          <w:b/>
+          <w:bCs/>
+          <w:kern w:val="0"/>
+          <w14:ligatures w14:val="none"/>
+        </w:rPr>
+      </w:pPr>
+      <w:r>
+        <w:rPr>
+          <w:rFonts w:ascii="Times New Roman" w:eastAsia="Times New Roman" w:hAnsi="Times New Roman" w:cs="Times New Roman"/>
+          <w:b/>
+          <w:bCs/>
+          <w:kern w:val="0"/>
+          <w14:ligatures w14:val="none"/>
+        </w:rPr>
+        <w:t>4. Business Insights</w:t>
+      </w:r>
+    </w:p>
+    <w:p>
+      <w:pPr>
+        <w:spacing w:before="100" w:beforeAutospacing="1" w:after="100" w:afterAutospacing="1" w:line="240" w:lineRule="auto"/>
+        <w:rPr>
+          <w:rFonts w:ascii="Times New Roman" w:eastAsia="Times New Roman" w:hAnsi="Times New Roman" w:cs="Times New Roman"/>
+          <w:kern w:val="0"/>
+          <w14:ligatures w14:val="none"/>
+        </w:rPr>
+      </w:pPr>
+      <w:r>
+        <w:rPr>
+          <w:rFonts w:ascii="Times New Roman" w:eastAsia="Times New Roman" w:hAnsi="Times New Roman" w:cs="Times New Roman"/>
+          <w:kern w:val="0"/>
+          <w14:ligatures w14:val="none"/>
+        </w:rPr>
+        <w:t xml:space="preserve">The MediaWave pipeline answered five core business questions through three analytics tables in the curated zone: </w:t>
+      </w:r>
+      <w:r>
+        <w:rPr>
+          <w:rFonts w:ascii="Courier New" w:eastAsia="Times New Roman" w:hAnsi="Courier New" w:cs="Courier New"/>
+          <w:kern w:val="0"/>
+          <w:sz w:val="20"/>
+          <w:szCs w:val="20"/>
+          <w14:ligatures w14:val="none"/>
+        </w:rPr>
+        <w:t>user-monthly-engagement</w:t>
+      </w:r>
+      <w:r>
+        <w:rPr>
+          <w:rFonts w:ascii="Times New Roman" w:eastAsia="Times New Roman" w:hAnsi="Times New Roman" w:cs="Times New Roman"/>
+          <w:kern w:val="0"/>
+          <w14:ligatures w14:val="none"/>
+        </w:rPr>
+        <w:t xml:space="preserve">, </w:t>
+      </w:r>
+      <w:r>
+        <w:rPr>
+          <w:rFonts w:ascii="Courier New" w:eastAsia="Times New Roman" w:hAnsi="Courier New" w:cs="Courier New"/>
+          <w:kern w:val="0"/>
+          <w:sz w:val="20"/>
+          <w:szCs w:val="20"/>
+          <w14:ligatures w14:val="none"/>
+        </w:rPr>
+        <w:t>content-performance</w:t>
+      </w:r>
+      <w:r>
+        <w:rPr>
+          <w:rFonts w:ascii="Times New Roman" w:eastAsia="Times New Roman" w:hAnsi="Times New Roman" w:cs="Times New Roman"/>
+          <w:kern w:val="0"/>
+          <w14:ligatures w14:val="none"/>
+        </w:rPr>
+        <w:t xml:space="preserve">, and </w:t>
+      </w:r>
+      <w:r>
+        <w:rPr>
+          <w:rFonts w:ascii="Courier New" w:eastAsia="Times New Roman" w:hAnsi="Courier New" w:cs="Courier New"/>
+          <w:kern w:val="0"/>
+          <w:sz w:val="20"/>
+          <w:szCs w:val="20"/>
+          <w14:ligatures w14:val="none"/>
+        </w:rPr>
+        <w:t>streaming-quality-region-isp</w:t>
+      </w:r>
+      <w:r>
+        <w:rPr>
+          <w:rFonts w:ascii="Times New Roman" w:eastAsia="Times New Roman" w:hAnsi="Times New Roman" w:cs="Times New Roman"/>
+          <w:kern w:val="0"/>
+          <w14:ligatures w14:val="none"/>
+        </w:rPr>
+        <w:t>. This section presents the most actionable findings and recommendations.</w:t>
+      </w:r>
+    </w:p>
+    <w:p>
+      <w:pPr>
+        <w:spacing w:before="100" w:beforeAutospacing="1" w:after="100" w:afterAutospacing="1" w:line="240" w:lineRule="auto"/>
+        <w:outlineLvl w:val="4"/>
+        <w:rPr>
+          <w:rFonts w:ascii="Times New Roman" w:eastAsia="Times New Roman" w:hAnsi="Times New Roman" w:cs="Times New Roman"/>
+          <w:b/>
+          <w:bCs/>
+          <w:kern w:val="0"/>
+          <w:sz w:val="20"/>
+          <w:szCs w:val="20"/>
+          <w14:ligatures w14:val="none"/>
+        </w:rPr>
+      </w:pPr>
+      <w:r>
+        <w:rPr>
+          <w:rFonts w:ascii="Times New Roman" w:eastAsia="Times New Roman" w:hAnsi="Times New Roman" w:cs="Times New Roman"/>
+          <w:b/>
+          <w:bCs/>
+          <w:kern w:val="0"/>
+          <w:sz w:val="20"/>
+          <w:szCs w:val="20"/>
+          <w14:ligatures w14:val="none"/>
+        </w:rPr>
+        <w:t>4.1 Content ROI: Which Titles Earn Their License Fees?</w:t>
+      </w:r>
+    </w:p>
+    <w:p>
+      <w:pPr>
+        <w:spacing w:before="100" w:beforeAutospacing="1" w:after="100" w:afterAutospacing="1" w:line="240" w:lineRule="auto"/>
+        <w:rPr>
+          <w:rFonts w:ascii="Times New Roman" w:eastAsia="Times New Roman" w:hAnsi="Times New Roman" w:cs="Times New Roman"/>
+          <w:kern w:val="0"/>
+          <w14:ligatures w14:val="none"/>
+        </w:rPr>
+      </w:pPr>
+      <w:r>
+        <w:rPr>
+          <w:rFonts w:ascii="Times New Roman" w:eastAsia="Times New Roman" w:hAnsi="Times New Roman" w:cs="Times New Roman"/>
+          <w:kern w:val="0"/>
+          <w14:ligatures w14:val="none"/>
+        </w:rPr>
+        <w:t xml:space="preserve">Our </w:t>
+      </w:r>
+      <w:r>
+        <w:rPr>
+          <w:rFonts w:ascii="Courier New" w:eastAsia="Times New Roman" w:hAnsi="Courier New" w:cs="Courier New"/>
+          <w:kern w:val="0"/>
+          <w:sz w:val="20"/>
+          <w:szCs w:val="20"/>
+          <w14:ligatures w14:val="none"/>
+        </w:rPr>
+        <w:t>content-performance</w:t>
+      </w:r>
+      <w:r>
+        <w:rPr>
+          <w:rFonts w:ascii="Times New Roman" w:eastAsia="Times New Roman" w:hAnsi="Times New Roman" w:cs="Times New Roman"/>
+          <w:kern w:val="0"/>
+          <w14:ligatures w14:val="none"/>
+        </w:rPr>
+        <w:t xml:space="preserve"> table calculates a custom metric — </w:t>
+      </w:r>
+      <w:r>
+        <w:rPr>
+          <w:rFonts w:ascii="Times New Roman" w:eastAsia="Times New Roman" w:hAnsi="Times New Roman" w:cs="Times New Roman"/>
+          <w:b/>
+          <w:bCs/>
+          <w:kern w:val="0"/>
+          <w14:ligatures w14:val="none"/>
+        </w:rPr>
+        <w:t>cost per viewing hour</w:t>
+      </w:r>
+      <w:r>
+        <w:rPr>
+          <w:rFonts w:ascii="Times New Roman" w:eastAsia="Times New Roman" w:hAnsi="Times New Roman" w:cs="Times New Roman"/>
+          <w:kern w:val="0"/>
+          <w14:ligatures w14:val="none"/>
+        </w:rPr>
+        <w:t xml:space="preserve"> — that divides each title's monthly license cost by total viewing hours generated. This metric directly answers MediaWave's question: </w:t>
+      </w:r>
+      <w:r>
+        <w:rPr>
+          <w:rFonts w:ascii="Times New Roman" w:eastAsia="Times New Roman" w:hAnsi="Times New Roman" w:cs="Times New Roman"/>
+          <w:i/>
+          <w:iCs/>
+          <w:kern w:val="0"/>
+          <w14:ligatures w14:val="none"/>
+        </w:rPr>
+        <w:t>which content investments are paying off?</w:t>
+      </w:r>
+    </w:p>
+    <w:p>
+      <w:pPr>
+        <w:spacing w:before="100" w:beforeAutospacing="1" w:after="100" w:afterAutospacing="1" w:line="240" w:lineRule="auto"/>
+        <w:rPr>
+          <w:rFonts w:ascii="Times New Roman" w:eastAsia="Times New Roman" w:hAnsi="Times New Roman" w:cs="Times New Roman"/>
+          <w:kern w:val="0"/>
+          <w14:ligatures w14:val="none"/>
+        </w:rPr>
+      </w:pPr>
+      <w:r>
+        <w:rPr>
+          <w:rFonts w:ascii="Times New Roman" w:eastAsia="Times New Roman" w:hAnsi="Times New Roman" w:cs="Times New Roman"/>
+          <w:kern w:val="0"/>
+          <w14:ligatures w14:val="none"/>
+        </w:rPr>
+        <w:lastRenderedPageBreak/>
+        <w:t>[INSERT FROM YUSUKE: Top 5 highest cost_per_viewing_hour titles (worst ROI) and bottom 5 (best ROI). Format: "X title costs $Y per viewing hour, Z% above the catalog median."]</w:t>
+      </w:r>
+    </w:p>
+    <w:p>
+      <w:pPr>
+        <w:spacing w:before="100" w:beforeAutospacing="1" w:after="100" w:afterAutospacing="1" w:line="240" w:lineRule="auto"/>
+        <w:rPr>
+          <w:rFonts w:ascii="Times New Roman" w:eastAsia="Times New Roman" w:hAnsi="Times New Roman" w:cs="Times New Roman"/>
+          <w:kern w:val="0"/>
+          <w14:ligatures w14:val="none"/>
+        </w:rPr>
+      </w:pPr>
+      <w:r>
+        <w:rPr>
+          <w:rFonts w:ascii="Times New Roman" w:eastAsia="Times New Roman" w:hAnsi="Times New Roman" w:cs="Times New Roman"/>
+          <w:b/>
+          <w:bCs/>
+          <w:kern w:val="0"/>
+          <w14:ligatures w14:val="none"/>
+        </w:rPr>
+        <w:t>Recommendation:</w:t>
+      </w:r>
+      <w:r>
+        <w:rPr>
+          <w:rFonts w:ascii="Times New Roman" w:eastAsia="Times New Roman" w:hAnsi="Times New Roman" w:cs="Times New Roman"/>
+          <w:kern w:val="0"/>
+          <w14:ligatures w14:val="none"/>
+        </w:rPr>
+        <w:t xml:space="preserve"> Titles in the top decile of </w:t>
+      </w:r>
+      <w:r>
+        <w:rPr>
+          <w:rFonts w:ascii="Courier New" w:eastAsia="Times New Roman" w:hAnsi="Courier New" w:cs="Courier New"/>
+          <w:kern w:val="0"/>
+          <w:sz w:val="20"/>
+          <w:szCs w:val="20"/>
+          <w14:ligatures w14:val="none"/>
+        </w:rPr>
+        <w:t>cost_per_viewing_hour</w:t>
+      </w:r>
+      <w:r>
+        <w:rPr>
+          <w:rFonts w:ascii="Times New Roman" w:eastAsia="Times New Roman" w:hAnsi="Times New Roman" w:cs="Times New Roman"/>
+          <w:kern w:val="0"/>
+          <w14:ligatures w14:val="none"/>
+        </w:rPr>
+        <w:t xml:space="preserve"> are candidates for non-renewal at next license cycle. If MediaWave dropped the bottom 10% of titles by ROI, estimated annual savings would be [insert: top-10 license costs sum × 12]. Conversely, titles in the bottom decile (best ROI) should anchor next quarter's marketing spend — they're already efficient and additional promotion compounds existing engagement.</w:t>
+      </w:r>
+    </w:p>
+    <w:p>
+      <w:pPr>
+        <w:spacing w:before="100" w:beforeAutospacing="1" w:after="100" w:afterAutospacing="1" w:line="240" w:lineRule="auto"/>
+        <w:outlineLvl w:val="4"/>
+        <w:rPr>
+          <w:rFonts w:ascii="Times New Roman" w:eastAsia="Times New Roman" w:hAnsi="Times New Roman" w:cs="Times New Roman"/>
+          <w:b/>
+          <w:bCs/>
+          <w:kern w:val="0"/>
+          <w:sz w:val="20"/>
+          <w:szCs w:val="20"/>
+          <w14:ligatures w14:val="none"/>
+        </w:rPr>
+      </w:pPr>
+      <w:r>
+        <w:rPr>
+          <w:rFonts w:ascii="Times New Roman" w:eastAsia="Times New Roman" w:hAnsi="Times New Roman" w:cs="Times New Roman"/>
+          <w:b/>
+          <w:bCs/>
+          <w:kern w:val="0"/>
+          <w:sz w:val="20"/>
+          <w:szCs w:val="20"/>
+          <w14:ligatures w14:val="none"/>
+        </w:rPr>
+        <w:t>4.2 Engagement Patterns: What Drives Watch Time?</w:t>
+      </w:r>
+    </w:p>
+    <w:p>
+      <w:pPr>
+        <w:spacing w:before="100" w:beforeAutospacing="1" w:after="100" w:afterAutospacing="1" w:line="240" w:lineRule="auto"/>
+        <w:rPr>
+          <w:rFonts w:ascii="Times New Roman" w:eastAsia="Times New Roman" w:hAnsi="Times New Roman" w:cs="Times New Roman"/>
+          <w:kern w:val="0"/>
+          <w14:ligatures w14:val="none"/>
+        </w:rPr>
+      </w:pPr>
+      <w:r>
+        <w:rPr>
+          <w:rFonts w:ascii="Times New Roman" w:eastAsia="Times New Roman" w:hAnsi="Times New Roman" w:cs="Times New Roman"/>
+          <w:kern w:val="0"/>
+          <w14:ligatures w14:val="none"/>
+        </w:rPr>
+        <w:t xml:space="preserve">The </w:t>
+      </w:r>
+      <w:r>
+        <w:rPr>
+          <w:rFonts w:ascii="Courier New" w:eastAsia="Times New Roman" w:hAnsi="Courier New" w:cs="Courier New"/>
+          <w:kern w:val="0"/>
+          <w:sz w:val="20"/>
+          <w:szCs w:val="20"/>
+          <w14:ligatures w14:val="none"/>
+        </w:rPr>
+        <w:t>user-monthly-engagement</w:t>
+      </w:r>
+      <w:r>
+        <w:rPr>
+          <w:rFonts w:ascii="Times New Roman" w:eastAsia="Times New Roman" w:hAnsi="Times New Roman" w:cs="Times New Roman"/>
+          <w:kern w:val="0"/>
+          <w14:ligatures w14:val="none"/>
+        </w:rPr>
+        <w:t xml:space="preserve"> table shows how engagement varies by subscription tier and demographic. Three patterns emerged:</w:t>
+      </w:r>
+    </w:p>
+    <w:p>
+      <w:pPr>
+        <w:spacing w:before="100" w:beforeAutospacing="1" w:after="100" w:afterAutospacing="1" w:line="240" w:lineRule="auto"/>
+        <w:rPr>
+          <w:rFonts w:ascii="Times New Roman" w:eastAsia="Times New Roman" w:hAnsi="Times New Roman" w:cs="Times New Roman"/>
+          <w:kern w:val="0"/>
+          <w14:ligatures w14:val="none"/>
+        </w:rPr>
+      </w:pPr>
+      <w:r>
+        <w:rPr>
+          <w:rFonts w:ascii="Times New Roman" w:eastAsia="Times New Roman" w:hAnsi="Times New Roman" w:cs="Times New Roman"/>
+          <w:kern w:val="0"/>
+          <w14:ligatures w14:val="none"/>
+        </w:rPr>
+        <w:t>[INSERT FROM YUSUKE: Average monthly watch hours by plan_type — likely Basic vs Standard vs Premium. Format: "Premium subscribers average X hours/month vs Y for Basic, a Z% gap."]</w:t>
+      </w:r>
+    </w:p>
+    <w:p>
+      <w:pPr>
+        <w:spacing w:before="100" w:beforeAutospacing="1" w:after="100" w:afterAutospacing="1" w:line="240" w:lineRule="auto"/>
+        <w:rPr>
+          <w:rFonts w:ascii="Times New Roman" w:eastAsia="Times New Roman" w:hAnsi="Times New Roman" w:cs="Times New Roman"/>
+          <w:kern w:val="0"/>
+          <w14:ligatures w14:val="none"/>
+        </w:rPr>
+      </w:pPr>
+      <w:r>
+        <w:rPr>
+          <w:rFonts w:ascii="Times New Roman" w:eastAsia="Times New Roman" w:hAnsi="Times New Roman" w:cs="Times New Roman"/>
+          <w:kern w:val="0"/>
+          <w14:ligatures w14:val="none"/>
+        </w:rPr>
+        <w:t>[INSERT FROM YUSUKE: Average completion % by plan_type. Higher tiers tend to finish more of what they start.]</w:t>
+      </w:r>
+    </w:p>
+    <w:p>
+      <w:pPr>
+        <w:spacing w:before="100" w:beforeAutospacing="1" w:after="100" w:afterAutospacing="1" w:line="240" w:lineRule="auto"/>
+        <w:rPr>
+          <w:rFonts w:ascii="Times New Roman" w:eastAsia="Times New Roman" w:hAnsi="Times New Roman" w:cs="Times New Roman"/>
+          <w:kern w:val="0"/>
+          <w14:ligatures w14:val="none"/>
+        </w:rPr>
+      </w:pPr>
+      <w:r>
+        <w:rPr>
+          <w:rFonts w:ascii="Times New Roman" w:eastAsia="Times New Roman" w:hAnsi="Times New Roman" w:cs="Times New Roman"/>
+          <w:kern w:val="0"/>
+          <w14:ligatures w14:val="none"/>
+        </w:rPr>
+        <w:t>[INSERT FROM YUSUKE: Distribution of unique_titles_watched per month — some users watch 1-2 titles deeply, others sample 20+. The two cohorts may need different recommendation strategies.]</w:t>
+      </w:r>
+    </w:p>
+    <w:p>
+      <w:pPr>
+        <w:spacing w:before="100" w:beforeAutospacing="1" w:after="100" w:afterAutospacing="1" w:line="240" w:lineRule="auto"/>
+        <w:rPr>
+          <w:rFonts w:ascii="Times New Roman" w:eastAsia="Times New Roman" w:hAnsi="Times New Roman" w:cs="Times New Roman"/>
+          <w:kern w:val="0"/>
+          <w14:ligatures w14:val="none"/>
+        </w:rPr>
+      </w:pPr>
+      <w:r>
+        <w:rPr>
+          <w:rFonts w:ascii="Times New Roman" w:eastAsia="Times New Roman" w:hAnsi="Times New Roman" w:cs="Times New Roman"/>
+          <w:b/>
+          <w:bCs/>
+          <w:kern w:val="0"/>
+          <w14:ligatures w14:val="none"/>
+        </w:rPr>
+        <w:t>Recommendation:</w:t>
+      </w:r>
+      <w:r>
+        <w:rPr>
+          <w:rFonts w:ascii="Times New Roman" w:eastAsia="Times New Roman" w:hAnsi="Times New Roman" w:cs="Times New Roman"/>
+          <w:kern w:val="0"/>
+          <w14:ligatures w14:val="none"/>
+        </w:rPr>
+        <w:t xml:space="preserve"> The completion-rate gap suggests Premium users either receive better recommendations or watch content they're more committed to. Investigate whether algorithmic recommendation weights differ by tier; if not, deliberately tune the algorithm to surface higher-completion content for Basic users to nudge upgrade conversions.</w:t>
+      </w:r>
+    </w:p>
+    <w:p>
+      <w:pPr>
+        <w:spacing w:before="100" w:beforeAutospacing="1" w:after="100" w:afterAutospacing="1" w:line="240" w:lineRule="auto"/>
+        <w:outlineLvl w:val="4"/>
+        <w:rPr>
+          <w:rFonts w:ascii="Times New Roman" w:eastAsia="Times New Roman" w:hAnsi="Times New Roman" w:cs="Times New Roman"/>
+          <w:b/>
+          <w:bCs/>
+          <w:kern w:val="0"/>
+          <w:sz w:val="20"/>
+          <w:szCs w:val="20"/>
+          <w14:ligatures w14:val="none"/>
+        </w:rPr>
+      </w:pPr>
+      <w:r>
+        <w:rPr>
+          <w:rFonts w:ascii="Times New Roman" w:eastAsia="Times New Roman" w:hAnsi="Times New Roman" w:cs="Times New Roman"/>
+          <w:b/>
+          <w:bCs/>
+          <w:kern w:val="0"/>
+          <w:sz w:val="20"/>
+          <w:szCs w:val="20"/>
+          <w14:ligatures w14:val="none"/>
+        </w:rPr>
+        <w:t>4.3 Churn Signals: Who's About to Cancel?</w:t>
+      </w:r>
+    </w:p>
+    <w:p>
+      <w:pPr>
+        <w:spacing w:before="100" w:beforeAutospacing="1" w:after="100" w:afterAutospacing="1" w:line="240" w:lineRule="auto"/>
+        <w:rPr>
+          <w:rFonts w:ascii="Times New Roman" w:eastAsia="Times New Roman" w:hAnsi="Times New Roman" w:cs="Times New Roman"/>
+          <w:kern w:val="0"/>
+          <w14:ligatures w14:val="none"/>
+        </w:rPr>
+      </w:pPr>
+      <w:r>
+        <w:rPr>
+          <w:rFonts w:ascii="Times New Roman" w:eastAsia="Times New Roman" w:hAnsi="Times New Roman" w:cs="Times New Roman"/>
+          <w:kern w:val="0"/>
+          <w14:ligatures w14:val="none"/>
+        </w:rPr>
+        <w:t xml:space="preserve">By including </w:t>
+      </w:r>
+      <w:r>
+        <w:rPr>
+          <w:rFonts w:ascii="Courier New" w:eastAsia="Times New Roman" w:hAnsi="Courier New" w:cs="Courier New"/>
+          <w:kern w:val="0"/>
+          <w:sz w:val="20"/>
+          <w:szCs w:val="20"/>
+          <w14:ligatures w14:val="none"/>
+        </w:rPr>
+        <w:t>is_churned</w:t>
+      </w:r>
+      <w:r>
+        <w:rPr>
+          <w:rFonts w:ascii="Times New Roman" w:eastAsia="Times New Roman" w:hAnsi="Times New Roman" w:cs="Times New Roman"/>
+          <w:kern w:val="0"/>
+          <w14:ligatures w14:val="none"/>
+        </w:rPr>
+        <w:t xml:space="preserve"> as a grouping dimension in </w:t>
+      </w:r>
+      <w:r>
+        <w:rPr>
+          <w:rFonts w:ascii="Courier New" w:eastAsia="Times New Roman" w:hAnsi="Courier New" w:cs="Courier New"/>
+          <w:kern w:val="0"/>
+          <w:sz w:val="20"/>
+          <w:szCs w:val="20"/>
+          <w14:ligatures w14:val="none"/>
+        </w:rPr>
+        <w:t>user-monthly-engagement</w:t>
+      </w:r>
+      <w:r>
+        <w:rPr>
+          <w:rFonts w:ascii="Times New Roman" w:eastAsia="Times New Roman" w:hAnsi="Times New Roman" w:cs="Times New Roman"/>
+          <w:kern w:val="0"/>
+          <w14:ligatures w14:val="none"/>
+        </w:rPr>
+        <w:t>, we can compare the final months of churned users against retained users:</w:t>
+      </w:r>
+    </w:p>
+    <w:p>
+      <w:pPr>
+        <w:spacing w:before="100" w:beforeAutospacing="1" w:after="100" w:afterAutospacing="1" w:line="240" w:lineRule="auto"/>
+        <w:rPr>
+          <w:rFonts w:ascii="Times New Roman" w:eastAsia="Times New Roman" w:hAnsi="Times New Roman" w:cs="Times New Roman"/>
+          <w:kern w:val="0"/>
+          <w14:ligatures w14:val="none"/>
+        </w:rPr>
+      </w:pPr>
+      <w:r>
+        <w:rPr>
+          <w:rFonts w:ascii="Times New Roman" w:eastAsia="Times New Roman" w:hAnsi="Times New Roman" w:cs="Times New Roman"/>
+          <w:kern w:val="0"/>
+          <w14:ligatures w14:val="none"/>
+        </w:rPr>
+        <w:t>[INSERT FROM YUSUKE: Difference in avg_completion_pct between churned and retained users in their last 30 days. Likely churned users have lower completion before cancellation.]</w:t>
+      </w:r>
+    </w:p>
+    <w:p>
+      <w:pPr>
+        <w:spacing w:before="100" w:beforeAutospacing="1" w:after="100" w:afterAutospacing="1" w:line="240" w:lineRule="auto"/>
+        <w:rPr>
+          <w:rFonts w:ascii="Times New Roman" w:eastAsia="Times New Roman" w:hAnsi="Times New Roman" w:cs="Times New Roman"/>
+          <w:kern w:val="0"/>
+          <w14:ligatures w14:val="none"/>
+        </w:rPr>
+      </w:pPr>
+      <w:r>
+        <w:rPr>
+          <w:rFonts w:ascii="Times New Roman" w:eastAsia="Times New Roman" w:hAnsi="Times New Roman" w:cs="Times New Roman"/>
+          <w:kern w:val="0"/>
+          <w14:ligatures w14:val="none"/>
+        </w:rPr>
+        <w:t>[INSERT FROM YUSUKE: Difference in interaction_count (likes, ratings, searches) between cohorts. Churned users likely show declining engagement signals.]</w:t>
+      </w:r>
+    </w:p>
+    <w:p>
+      <w:pPr>
+        <w:spacing w:before="100" w:beforeAutospacing="1" w:after="100" w:afterAutospacing="1" w:line="240" w:lineRule="auto"/>
+        <w:rPr>
+          <w:rFonts w:ascii="Times New Roman" w:eastAsia="Times New Roman" w:hAnsi="Times New Roman" w:cs="Times New Roman"/>
+          <w:kern w:val="0"/>
+          <w14:ligatures w14:val="none"/>
+        </w:rPr>
+      </w:pPr>
+      <w:r>
+        <w:rPr>
+          <w:rFonts w:ascii="Times New Roman" w:eastAsia="Times New Roman" w:hAnsi="Times New Roman" w:cs="Times New Roman"/>
+          <w:kern w:val="0"/>
+          <w14:ligatures w14:val="none"/>
+        </w:rPr>
+        <w:t>[INSERT FROM YUSUKE: Difference in avg_buffering_events between cohorts. If buffering is meaningfully higher among churners, that's a direct technical lever for retention.]</w:t>
+      </w:r>
+    </w:p>
+    <w:p>
+      <w:pPr>
+        <w:spacing w:before="100" w:beforeAutospacing="1" w:after="100" w:afterAutospacing="1" w:line="240" w:lineRule="auto"/>
+        <w:rPr>
+          <w:rFonts w:ascii="Times New Roman" w:eastAsia="Times New Roman" w:hAnsi="Times New Roman" w:cs="Times New Roman"/>
+          <w:kern w:val="0"/>
+          <w14:ligatures w14:val="none"/>
+        </w:rPr>
+      </w:pPr>
+      <w:r>
+        <w:rPr>
+          <w:rFonts w:ascii="Times New Roman" w:eastAsia="Times New Roman" w:hAnsi="Times New Roman" w:cs="Times New Roman"/>
+          <w:b/>
+          <w:bCs/>
+          <w:kern w:val="0"/>
+          <w14:ligatures w14:val="none"/>
+        </w:rPr>
+        <w:t>Recommendation:</w:t>
+      </w:r>
+      <w:r>
+        <w:rPr>
+          <w:rFonts w:ascii="Times New Roman" w:eastAsia="Times New Roman" w:hAnsi="Times New Roman" w:cs="Times New Roman"/>
+          <w:kern w:val="0"/>
+          <w14:ligatures w14:val="none"/>
+        </w:rPr>
+        <w:t xml:space="preserve"> Build a churn early-warning model using these three signals as features. Users showing 30-day declines in completion %, interaction count, AND elevated buffering </w:t>
+      </w:r>
+      <w:r>
+        <w:rPr>
+          <w:rFonts w:ascii="Times New Roman" w:eastAsia="Times New Roman" w:hAnsi="Times New Roman" w:cs="Times New Roman"/>
+          <w:kern w:val="0"/>
+          <w14:ligatures w14:val="none"/>
+        </w:rPr>
+        <w:lastRenderedPageBreak/>
+        <w:t>events should trigger automated retention interventions (proactive outreach, free month, recommendation refresh) before they cancel. Even a 5% reduction in churn through this targeting would translate to [insert: estimated annual revenue saved based on plan price × user count].</w:t>
+      </w:r>
+    </w:p>
+    <w:p>
+      <w:pPr>
+        <w:spacing w:before="100" w:beforeAutospacing="1" w:after="100" w:afterAutospacing="1" w:line="240" w:lineRule="auto"/>
+        <w:outlineLvl w:val="4"/>
+        <w:rPr>
+          <w:rFonts w:ascii="Times New Roman" w:eastAsia="Times New Roman" w:hAnsi="Times New Roman" w:cs="Times New Roman"/>
+          <w:b/>
+          <w:bCs/>
+          <w:kern w:val="0"/>
+          <w:sz w:val="20"/>
+          <w:szCs w:val="20"/>
+          <w14:ligatures w14:val="none"/>
+        </w:rPr>
+      </w:pPr>
+      <w:r>
+        <w:rPr>
+          <w:rFonts w:ascii="Times New Roman" w:eastAsia="Times New Roman" w:hAnsi="Times New Roman" w:cs="Times New Roman"/>
+          <w:b/>
+          <w:bCs/>
+          <w:kern w:val="0"/>
+          <w:sz w:val="20"/>
+          <w:szCs w:val="20"/>
+          <w14:ligatures w14:val="none"/>
+        </w:rPr>
+        <w:t>4.4 Streaming Quality: Where Should MediaWave Invest in Infrastructure?</w:t>
+      </w:r>
+    </w:p>
+    <w:p>
+      <w:pPr>
+        <w:spacing w:before="100" w:beforeAutospacing="1" w:after="100" w:afterAutospacing="1" w:line="240" w:lineRule="auto"/>
+        <w:rPr>
+          <w:rFonts w:ascii="Times New Roman" w:eastAsia="Times New Roman" w:hAnsi="Times New Roman" w:cs="Times New Roman"/>
+          <w:kern w:val="0"/>
+          <w14:ligatures w14:val="none"/>
+        </w:rPr>
+      </w:pPr>
+      <w:r>
+        <w:rPr>
+          <w:rFonts w:ascii="Times New Roman" w:eastAsia="Times New Roman" w:hAnsi="Times New Roman" w:cs="Times New Roman"/>
+          <w:kern w:val="0"/>
+          <w14:ligatures w14:val="none"/>
+        </w:rPr>
+        <w:t xml:space="preserve">The </w:t>
+      </w:r>
+      <w:r>
+        <w:rPr>
+          <w:rFonts w:ascii="Courier New" w:eastAsia="Times New Roman" w:hAnsi="Courier New" w:cs="Courier New"/>
+          <w:kern w:val="0"/>
+          <w:sz w:val="20"/>
+          <w:szCs w:val="20"/>
+          <w14:ligatures w14:val="none"/>
+        </w:rPr>
+        <w:t>streaming-quality-region-isp</w:t>
+      </w:r>
+      <w:r>
+        <w:rPr>
+          <w:rFonts w:ascii="Times New Roman" w:eastAsia="Times New Roman" w:hAnsi="Times New Roman" w:cs="Times New Roman"/>
+          <w:kern w:val="0"/>
+          <w14:ligatures w14:val="none"/>
+        </w:rPr>
+        <w:t xml:space="preserve"> table reveals which combinations of CDN region and ISP deliver the worst experience:</w:t>
+      </w:r>
+    </w:p>
+    <w:p>
+      <w:pPr>
+        <w:spacing w:before="100" w:beforeAutospacing="1" w:after="100" w:afterAutospacing="1" w:line="240" w:lineRule="auto"/>
+        <w:rPr>
+          <w:rFonts w:ascii="Times New Roman" w:eastAsia="Times New Roman" w:hAnsi="Times New Roman" w:cs="Times New Roman"/>
+          <w:kern w:val="0"/>
+          <w14:ligatures w14:val="none"/>
+        </w:rPr>
+      </w:pPr>
+      <w:r>
+        <w:rPr>
+          <w:rFonts w:ascii="Times New Roman" w:eastAsia="Times New Roman" w:hAnsi="Times New Roman" w:cs="Times New Roman"/>
+          <w:kern w:val="0"/>
+          <w14:ligatures w14:val="none"/>
+        </w:rPr>
+        <w:t>[INSERT FROM YUSUKE: Top 3 worst-performing region/ISP combinations by avg_buffering_events. Format: "Users on [ISP] in [region] experience X buffering events per session, Y× the global average."]</w:t>
+      </w:r>
+    </w:p>
+    <w:p>
+      <w:pPr>
+        <w:spacing w:before="100" w:beforeAutospacing="1" w:after="100" w:afterAutospacing="1" w:line="240" w:lineRule="auto"/>
+        <w:rPr>
+          <w:rFonts w:ascii="Times New Roman" w:eastAsia="Times New Roman" w:hAnsi="Times New Roman" w:cs="Times New Roman"/>
+          <w:kern w:val="0"/>
+          <w14:ligatures w14:val="none"/>
+        </w:rPr>
+      </w:pPr>
+      <w:r>
+        <w:rPr>
+          <w:rFonts w:ascii="Times New Roman" w:eastAsia="Times New Roman" w:hAnsi="Times New Roman" w:cs="Times New Roman"/>
+          <w:kern w:val="0"/>
+          <w14:ligatures w14:val="none"/>
+        </w:rPr>
+        <w:t>[INSERT FROM YUSUKE: Correlation between avg_buffering_events and avg_completion_pct across all sessions. Likely strongly negative — bad streaming quality kills completion.]</w:t>
+      </w:r>
+    </w:p>
+    <w:p>
+      <w:pPr>
+        <w:spacing w:before="100" w:beforeAutospacing="1" w:after="100" w:afterAutospacing="1" w:line="240" w:lineRule="auto"/>
+        <w:rPr>
+          <w:rFonts w:ascii="Times New Roman" w:eastAsia="Times New Roman" w:hAnsi="Times New Roman" w:cs="Times New Roman"/>
+          <w:kern w:val="0"/>
+          <w14:ligatures w14:val="none"/>
+        </w:rPr>
+      </w:pPr>
+      <w:r>
+        <w:rPr>
+          <w:rFonts w:ascii="Times New Roman" w:eastAsia="Times New Roman" w:hAnsi="Times New Roman" w:cs="Times New Roman"/>
+          <w:b/>
+          <w:bCs/>
+          <w:kern w:val="0"/>
+          <w14:ligatures w14:val="none"/>
+        </w:rPr>
+        <w:t>Recommendation:</w:t>
+      </w:r>
+      <w:r>
+        <w:rPr>
+          <w:rFonts w:ascii="Times New Roman" w:eastAsia="Times New Roman" w:hAnsi="Times New Roman" w:cs="Times New Roman"/>
+          <w:kern w:val="0"/>
+          <w14:ligatures w14:val="none"/>
+        </w:rPr>
+        <w:t xml:space="preserve"> Negotiate dedicated peering or upgrade CDN capacity for the top 3 problem region/ISP combinations. Given the buffering–completion correlation, even a 20% reduction in buffering for affected users could improve their completion by an estimated [insert: regression-derived percentage], directly extending watch time and reducing churn risk.</w:t>
+      </w:r>
+    </w:p>
+    <w:p>
+      <w:pPr>
+        <w:spacing w:before="100" w:beforeAutospacing="1" w:after="100" w:afterAutospacing="1" w:line="240" w:lineRule="auto"/>
+        <w:outlineLvl w:val="4"/>
+        <w:rPr>
+          <w:rFonts w:ascii="Times New Roman" w:eastAsia="Times New Roman" w:hAnsi="Times New Roman" w:cs="Times New Roman"/>
+          <w:b/>
+          <w:bCs/>
+          <w:kern w:val="0"/>
+          <w:sz w:val="20"/>
+          <w:szCs w:val="20"/>
+          <w14:ligatures w14:val="none"/>
+        </w:rPr>
+      </w:pPr>
+      <w:r>
+        <w:rPr>
+          <w:rFonts w:ascii="Times New Roman" w:eastAsia="Times New Roman" w:hAnsi="Times New Roman" w:cs="Times New Roman"/>
+          <w:b/>
+          <w:bCs/>
+          <w:kern w:val="0"/>
+          <w:sz w:val="20"/>
+          <w:szCs w:val="20"/>
+          <w14:ligatures w14:val="none"/>
+        </w:rPr>
+        <w:t>4.5 Summary of Recommendations</w:t>
+      </w:r>
+    </w:p>
+    <w:tbl>
+      <w:tblPr>
+        <w:tblW w:w="0" w:type="auto"/>
+        <w:tblCellSpacing w:w="15" w:type="dxa"/>
+        <w:tblCellMar>
+          <w:top w:w="15" w:type="dxa"/>
+          <w:left w:w="15" w:type="dxa"/>
+          <w:bottom w:w="15" w:type="dxa"/>
+          <w:right w:w="15" w:type="dxa"/>
+        </w:tblCellMar>
+        <w:tblLook w:val="04A0" w:firstRow="1" w:lastRow="0" w:firstColumn="1" w:lastColumn="0" w:noHBand="0" w:noVBand="1"/>
+      </w:tblPr>
+      <w:tblGrid>
+        <w:gridCol w:w="888"/>
+        <w:gridCol w:w="4819"/>
+        <w:gridCol w:w="3653"/>
+      </w:tblGrid>
+      <w:tr>
+        <w:trPr>
+          <w:tblHeader/>
+          <w:tblCellSpacing w:w="15" w:type="dxa"/>
+        </w:trPr>
+        <w:tc>
+          <w:tcPr>
+            <w:tcW w:w="0" w:type="auto"/>
+            <w:vAlign w:val="center"/>
+            <w:hideMark/>
+          </w:tcPr>
+          <w:p>
+            <w:pPr>
+              <w:spacing w:after="0" w:line="240" w:lineRule="auto"/>
+              <w:jc w:val="center"/>
+              <w:rPr>
+                <w:rFonts w:ascii="Times New Roman" w:eastAsia="Times New Roman" w:hAnsi="Times New Roman" w:cs="Times New Roman"/>
+                <w:b/>
+                <w:bCs/>
+                <w:kern w:val="0"/>
+                <w14:ligatures w14:val="none"/>
+              </w:rPr>
+            </w:pPr>
+            <w:r>
+              <w:rPr>
+                <w:rFonts w:ascii="Times New Roman" w:eastAsia="Times New Roman" w:hAnsi="Times New Roman" w:cs="Times New Roman"/>
+                <w:b/>
+                <w:bCs/>
+                <w:kern w:val="0"/>
+                <w14:ligatures w14:val="none"/>
+              </w:rPr>
+              <w:t>Priority</w:t>
+            </w:r>
+          </w:p>
+        </w:tc>
+        <w:tc>
+          <w:tcPr>
+            <w:tcW w:w="0" w:type="auto"/>
+            <w:vAlign w:val="center"/>
+            <w:hideMark/>
+          </w:tcPr>
+          <w:p>
+            <w:pPr>
+              <w:spacing w:after="0" w:line="240" w:lineRule="auto"/>
+              <w:jc w:val="center"/>
+              <w:rPr>
+                <w:rFonts w:ascii="Times New Roman" w:eastAsia="Times New Roman" w:hAnsi="Times New Roman" w:cs="Times New Roman"/>
+                <w:b/>
+                <w:bCs/>
+                <w:kern w:val="0"/>
+                <w14:ligatures w14:val="none"/>
+              </w:rPr>
+            </w:pPr>
+            <w:r>
+              <w:rPr>
+                <w:rFonts w:ascii="Times New Roman" w:eastAsia="Times New Roman" w:hAnsi="Times New Roman" w:cs="Times New Roman"/>
+                <w:b/>
+                <w:bCs/>
+                <w:kern w:val="0"/>
+                <w14:ligatures w14:val="none"/>
+              </w:rPr>
+              <w:t>Recommendation</w:t>
+            </w:r>
+          </w:p>
+        </w:tc>
+        <w:tc>
+          <w:tcPr>
+            <w:tcW w:w="0" w:type="auto"/>
+            <w:vAlign w:val="center"/>
+            <w:hideMark/>
+          </w:tcPr>
+          <w:p>
+            <w:pPr>
+              <w:spacing w:after="0" w:line="240" w:lineRule="auto"/>
+              <w:jc w:val="center"/>
+              <w:rPr>
+                <w:rFonts w:ascii="Times New Roman" w:eastAsia="Times New Roman" w:hAnsi="Times New Roman" w:cs="Times New Roman"/>
+                <w:b/>
+                <w:bCs/>
+                <w:kern w:val="0"/>
+                <w14:ligatures w14:val="none"/>
+              </w:rPr>
+            </w:pPr>
+            <w:r>
+              <w:rPr>
+                <w:rFonts w:ascii="Times New Roman" w:eastAsia="Times New Roman" w:hAnsi="Times New Roman" w:cs="Times New Roman"/>
+                <w:b/>
+                <w:bCs/>
+                <w:kern w:val="0"/>
+                <w14:ligatures w14:val="none"/>
+              </w:rPr>
+              <w:t>Expected Impact</w:t>
+            </w:r>
+          </w:p>
+        </w:tc>
+      </w:tr>
+      <w:tr>
+        <w:trPr>
+          <w:tblCellSpacing w:w="15" w:type="dxa"/>
+        </w:trPr>
+        <w:tc>
+          <w:tcPr>
+            <w:tcW w:w="0" w:type="auto"/>
+            <w:vAlign w:val="center"/>
+            <w:hideMark/>
+          </w:tcPr>
+          <w:p>
+            <w:pPr>
+              <w:spacing w:after="0" w:line="240" w:lineRule="auto"/>
+              <w:rPr>
+                <w:rFonts w:ascii="Times New Roman" w:eastAsia="Times New Roman" w:hAnsi="Times New Roman" w:cs="Times New Roman"/>
+                <w:kern w:val="0"/>
+                <w14:ligatures w14:val="none"/>
+              </w:rPr>
+            </w:pPr>
+            <w:r>
+              <w:rPr>
+                <w:rFonts w:ascii="Times New Roman" w:eastAsia="Times New Roman" w:hAnsi="Times New Roman" w:cs="Times New Roman"/>
+                <w:kern w:val="0"/>
+                <w14:ligatures w14:val="none"/>
+              </w:rPr>
+              <w:t>1</w:t>
+            </w:r>
+          </w:p>
+        </w:tc>
+        <w:tc>
+          <w:tcPr>
+            <w:tcW w:w="0" w:type="auto"/>
+            <w:vAlign w:val="center"/>
+            <w:hideMark/>
+          </w:tcPr>
+          <w:p>
+            <w:pPr>
+              <w:spacing w:after="0" w:line="240" w:lineRule="auto"/>
+              <w:rPr>
+                <w:rFonts w:ascii="Times New Roman" w:eastAsia="Times New Roman" w:hAnsi="Times New Roman" w:cs="Times New Roman"/>
+                <w:kern w:val="0"/>
+                <w14:ligatures w14:val="none"/>
+              </w:rPr>
+            </w:pPr>
+            <w:r>
+              <w:rPr>
+                <w:rFonts w:ascii="Times New Roman" w:eastAsia="Times New Roman" w:hAnsi="Times New Roman" w:cs="Times New Roman"/>
+                <w:kern w:val="0"/>
+                <w14:ligatures w14:val="none"/>
+              </w:rPr>
+              <w:t xml:space="preserve">Drop bottom-decile content by </w:t>
+            </w:r>
+            <w:r>
+              <w:rPr>
+                <w:rFonts w:ascii="Courier New" w:eastAsia="Times New Roman" w:hAnsi="Courier New" w:cs="Courier New"/>
+                <w:kern w:val="0"/>
+                <w:sz w:val="20"/>
+                <w:szCs w:val="20"/>
+                <w14:ligatures w14:val="none"/>
+              </w:rPr>
+              <w:t>cost_per_viewing_hour</w:t>
+            </w:r>
+          </w:p>
+        </w:tc>
+        <w:tc>
+          <w:tcPr>
+            <w:tcW w:w="0" w:type="auto"/>
+            <w:vAlign w:val="center"/>
+            <w:hideMark/>
+          </w:tcPr>
+          <w:p>
+            <w:pPr>
+              <w:spacing w:after="0" w:line="240" w:lineRule="auto"/>
+              <w:rPr>
+                <w:rFonts w:ascii="Times New Roman" w:eastAsia="Times New Roman" w:hAnsi="Times New Roman" w:cs="Times New Roman"/>
+                <w:kern w:val="0"/>
+                <w14:ligatures w14:val="none"/>
+              </w:rPr>
+            </w:pPr>
+            <w:r>
+              <w:rPr>
+                <w:rFonts w:ascii="Times New Roman" w:eastAsia="Times New Roman" w:hAnsi="Times New Roman" w:cs="Times New Roman"/>
+                <w:kern w:val="0"/>
+                <w14:ligatures w14:val="none"/>
+              </w:rPr>
+              <w:t>$[from 4.1] annual license savings</w:t>
+            </w:r>
+          </w:p>
+        </w:tc>
+      </w:tr>
+      <w:tr>
+        <w:trPr>
+          <w:tblCellSpacing w:w="15" w:type="dxa"/>
+        </w:trPr>
+        <w:tc>
+          <w:tcPr>
+            <w:tcW w:w="0" w:type="auto"/>
+            <w:vAlign w:val="center"/>
+            <w:hideMark/>
+          </w:tcPr>
+          <w:p>
+            <w:pPr>
+              <w:spacing w:after="0" w:line="240" w:lineRule="auto"/>
+              <w:rPr>
+                <w:rFonts w:ascii="Times New Roman" w:eastAsia="Times New Roman" w:hAnsi="Times New Roman" w:cs="Times New Roman"/>
+                <w:kern w:val="0"/>
+                <w14:ligatures w14:val="none"/>
+              </w:rPr>
+            </w:pPr>
+            <w:r>
+              <w:rPr>
+                <w:rFonts w:ascii="Times New Roman" w:eastAsia="Times New Roman" w:hAnsi="Times New Roman" w:cs="Times New Roman"/>
+                <w:kern w:val="0"/>
+                <w14:ligatures w14:val="none"/>
+              </w:rPr>
+              <w:t>2</w:t>
+            </w:r>
+          </w:p>
+        </w:tc>
+        <w:tc>
+          <w:tcPr>
+            <w:tcW w:w="0" w:type="auto"/>
+            <w:vAlign w:val="center"/>
+            <w:hideMark/>
+          </w:tcPr>
+          <w:p>
+            <w:pPr>
+              <w:spacing w:after="0" w:line="240" w:lineRule="auto"/>
+              <w:rPr>
+                <w:rFonts w:ascii="Times New Roman" w:eastAsia="Times New Roman" w:hAnsi="Times New Roman" w:cs="Times New Roman"/>
+                <w:kern w:val="0"/>
+                <w14:ligatures w14:val="none"/>
+              </w:rPr>
+            </w:pPr>
+            <w:r>
+              <w:rPr>
+                <w:rFonts w:ascii="Times New Roman" w:eastAsia="Times New Roman" w:hAnsi="Times New Roman" w:cs="Times New Roman"/>
+                <w:kern w:val="0"/>
+                <w14:ligatures w14:val="none"/>
+              </w:rPr>
+              <w:t>Build churn early-warning model from engagement + quality features</w:t>
+            </w:r>
+          </w:p>
+        </w:tc>
+        <w:tc>
+          <w:tcPr>
+            <w:tcW w:w="0" w:type="auto"/>
+            <w:vAlign w:val="center"/>
+            <w:hideMark/>
+          </w:tcPr>
+          <w:p>
+            <w:pPr>
+              <w:spacing w:after="0" w:line="240" w:lineRule="auto"/>
+              <w:rPr>
+                <w:rFonts w:ascii="Times New Roman" w:eastAsia="Times New Roman" w:hAnsi="Times New Roman" w:cs="Times New Roman"/>
+                <w:kern w:val="0"/>
+                <w14:ligatures w14:val="none"/>
+              </w:rPr>
+            </w:pPr>
+            <w:r>
+              <w:rPr>
+                <w:rFonts w:ascii="Times New Roman" w:eastAsia="Times New Roman" w:hAnsi="Times New Roman" w:cs="Times New Roman"/>
+                <w:kern w:val="0"/>
+                <w14:ligatures w14:val="none"/>
+              </w:rPr>
+              <w:t>[from 4.3] reduction in monthly churn</w:t>
+            </w:r>
+          </w:p>
+        </w:tc>
+      </w:tr>
+      <w:tr>
+        <w:trPr>
+          <w:tblCellSpacing w:w="15" w:type="dxa"/>
+        </w:trPr>
+        <w:tc>
+          <w:tcPr>
+            <w:tcW w:w="0" w:type="auto"/>
+            <w:vAlign w:val="center"/>
+            <w:hideMark/>
+          </w:tcPr>
+          <w:p>
+            <w:pPr>
+              <w:spacing w:after="0" w:line="240" w:lineRule="auto"/>
+              <w:rPr>
+                <w:rFonts w:ascii="Times New Roman" w:eastAsia="Times New Roman" w:hAnsi="Times New Roman" w:cs="Times New Roman"/>
+                <w:kern w:val="0"/>
+                <w14:ligatures w14:val="none"/>
+              </w:rPr>
+            </w:pPr>
+            <w:r>
+              <w:rPr>
+                <w:rFonts w:ascii="Times New Roman" w:eastAsia="Times New Roman" w:hAnsi="Times New Roman" w:cs="Times New Roman"/>
+                <w:kern w:val="0"/>
+                <w14:ligatures w14:val="none"/>
+              </w:rPr>
+              <w:t>3</w:t>
+            </w:r>
+          </w:p>
+        </w:tc>
+        <w:tc>
+          <w:tcPr>
+            <w:tcW w:w="0" w:type="auto"/>
+            <w:vAlign w:val="center"/>
+            <w:hideMark/>
+          </w:tcPr>
+          <w:p>
+            <w:pPr>
+              <w:spacing w:after="0" w:line="240" w:lineRule="auto"/>
+              <w:rPr>
+                <w:rFonts w:ascii="Times New Roman" w:eastAsia="Times New Roman" w:hAnsi="Times New Roman" w:cs="Times New Roman"/>
+                <w:kern w:val="0"/>
+                <w14:ligatures w14:val="none"/>
+              </w:rPr>
+            </w:pPr>
+            <w:r>
+              <w:rPr>
+                <w:rFonts w:ascii="Times New Roman" w:eastAsia="Times New Roman" w:hAnsi="Times New Roman" w:cs="Times New Roman"/>
+                <w:kern w:val="0"/>
+                <w14:ligatures w14:val="none"/>
+              </w:rPr>
+              <w:t>Upgrade infrastructure for worst region/ISP combinations</w:t>
+            </w:r>
+          </w:p>
+        </w:tc>
+        <w:tc>
+          <w:tcPr>
+            <w:tcW w:w="0" w:type="auto"/>
+            <w:vAlign w:val="center"/>
+            <w:hideMark/>
+          </w:tcPr>
+          <w:p>
+            <w:pPr>
+              <w:spacing w:after="0" w:line="240" w:lineRule="auto"/>
+              <w:rPr>
+                <w:rFonts w:ascii="Times New Roman" w:eastAsia="Times New Roman" w:hAnsi="Times New Roman" w:cs="Times New Roman"/>
+                <w:kern w:val="0"/>
+                <w14:ligatures w14:val="none"/>
+              </w:rPr>
+            </w:pPr>
+            <w:r>
+              <w:rPr>
+                <w:rFonts w:ascii="Times New Roman" w:eastAsia="Times New Roman" w:hAnsi="Times New Roman" w:cs="Times New Roman"/>
+                <w:kern w:val="0"/>
+                <w14:ligatures w14:val="none"/>
+              </w:rPr>
+              <w:t>[from 4.4] completion improvement among affected users</w:t>
+            </w:r>
+          </w:p>
+        </w:tc>
+      </w:tr>
+      <w:tr>
+        <w:trPr>
+          <w:tblCellSpacing w:w="15" w:type="dxa"/>
+        </w:trPr>
+        <w:tc>
+          <w:tcPr>
+            <w:tcW w:w="0" w:type="auto"/>
+            <w:vAlign w:val="center"/>
+            <w:hideMark/>
+          </w:tcPr>
+          <w:p>
+            <w:pPr>
+              <w:spacing w:after="0" w:line="240" w:lineRule="auto"/>
+              <w:rPr>
+                <w:rFonts w:ascii="Times New Roman" w:eastAsia="Times New Roman" w:hAnsi="Times New Roman" w:cs="Times New Roman"/>
+                <w:kern w:val="0"/>
+                <w14:ligatures w14:val="none"/>
+              </w:rPr>
+            </w:pPr>
+            <w:r>
+              <w:rPr>
+                <w:rFonts w:ascii="Times New Roman" w:eastAsia="Times New Roman" w:hAnsi="Times New Roman" w:cs="Times New Roman"/>
+                <w:kern w:val="0"/>
+                <w14:ligatures w14:val="none"/>
+              </w:rPr>
+              <w:t>4</w:t>
+            </w:r>
+          </w:p>
+        </w:tc>
+        <w:tc>
+          <w:tcPr>
+            <w:tcW w:w="0" w:type="auto"/>
+            <w:vAlign w:val="center"/>
+            <w:hideMark/>
+          </w:tcPr>
+          <w:p>
+            <w:pPr>
+              <w:spacing w:after="0" w:line="240" w:lineRule="auto"/>
+              <w:rPr>
+                <w:rFonts w:ascii="Times New Roman" w:eastAsia="Times New Roman" w:hAnsi="Times New Roman" w:cs="Times New Roman"/>
+                <w:kern w:val="0"/>
+                <w14:ligatures w14:val="none"/>
+              </w:rPr>
+            </w:pPr>
+            <w:r>
+              <w:rPr>
+                <w:rFonts w:ascii="Times New Roman" w:eastAsia="Times New Roman" w:hAnsi="Times New Roman" w:cs="Times New Roman"/>
+                <w:kern w:val="0"/>
+                <w14:ligatures w14:val="none"/>
+              </w:rPr>
+              <w:t>Tier-aware recommendation tuning to lift Basic-user completion</w:t>
+            </w:r>
+          </w:p>
+        </w:tc>
+        <w:tc>
+          <w:tcPr>
+            <w:tcW w:w="0" w:type="auto"/>
+            <w:vAlign w:val="center"/>
+            <w:hideMark/>
+          </w:tcPr>
+          <w:p>
+            <w:pPr>
+              <w:spacing w:after="0" w:line="240" w:lineRule="auto"/>
+              <w:rPr>
+                <w:rFonts w:ascii="Times New Roman" w:eastAsia="Times New Roman" w:hAnsi="Times New Roman" w:cs="Times New Roman"/>
+                <w:kern w:val="0"/>
+                <w14:ligatures w14:val="none"/>
+              </w:rPr>
+            </w:pPr>
+            <w:r>
+              <w:rPr>
+                <w:rFonts w:ascii="Times New Roman" w:eastAsia="Times New Roman" w:hAnsi="Times New Roman" w:cs="Times New Roman"/>
+                <w:kern w:val="0"/>
+                <w14:ligatures w14:val="none"/>
+              </w:rPr>
+              <w:t>Increased upgrade conversion (estimate after A/B test)</w:t>
+            </w:r>
+          </w:p>
+        </w:tc>
+      </w:tr>
+    </w:tbl>
+    <w:p>
+      <w:pPr>
+        <w:spacing w:before="100" w:beforeAutospacing="1" w:after="100" w:afterAutospacing="1" w:line="240" w:lineRule="auto"/>
+        <w:rPr>
+          <w:rFonts w:ascii="Times New Roman" w:eastAsia="Times New Roman" w:hAnsi="Times New Roman" w:cs="Times New Roman"/>
+          <w:kern w:val="0"/>
+          <w14:ligatures w14:val="none"/>
+        </w:rPr>
+      </w:pPr>
+      <w:r>
+        <w:rPr>
+          <w:rFonts w:ascii="Times New Roman" w:eastAsia="Times New Roman" w:hAnsi="Times New Roman" w:cs="Times New Roman"/>
+          <w:kern w:val="0"/>
+          <w14:ligatures w14:val="none"/>
+        </w:rPr>
+        <w:t>These recommendations are implementable from the data we processed — the pipeline produces exactly the analytics tables needed to operationalize each one.</w:t>
       </w:r>
     </w:p>
     <w:p/>

</xml_diff>

<commit_message>
Added draft for part 3 and 5 in Exec Summary
</commit_message>
<xml_diff>
--- a/Final Project/report/Executive Summary - Version 1 (04.30.26).docx
+++ b/Final Project/report/Executive Summary - Version 1 (04.30.26).docx
@@ -1137,6 +1137,498 @@
           <w:kern w:val="0"/>
           <w14:ligatures w14:val="none"/>
         </w:rPr>
+        <w:t>3. Implementation</w:t>
+      </w:r>
+    </w:p>
+    <w:p>
+      <w:pPr>
+        <w:spacing w:before="100" w:beforeAutospacing="1" w:after="100" w:afterAutospacing="1" w:line="240" w:lineRule="auto"/>
+        <w:rPr>
+          <w:rFonts w:ascii="Times New Roman" w:eastAsia="Times New Roman" w:hAnsi="Times New Roman" w:cs="Times New Roman"/>
+          <w:kern w:val="0"/>
+          <w14:ligatures w14:val="none"/>
+        </w:rPr>
+      </w:pPr>
+      <w:r>
+        <w:rPr>
+          <w:rFonts w:ascii="Times New Roman" w:eastAsia="Times New Roman" w:hAnsi="Times New Roman" w:cs="Times New Roman"/>
+          <w:kern w:val="0"/>
+          <w14:ligatures w14:val="none"/>
+        </w:rPr>
+        <w:t>This section documents the key technical decisions made in building the MediaWave pipeline, the challenges encountered, and the strategies used to ensure reliability and reproducibility.</w:t>
+      </w:r>
+    </w:p>
+    <w:p>
+      <w:pPr>
+        <w:spacing w:before="100" w:beforeAutospacing="1" w:after="100" w:afterAutospacing="1" w:line="240" w:lineRule="auto"/>
+        <w:outlineLvl w:val="4"/>
+        <w:rPr>
+          <w:rFonts w:ascii="Times New Roman" w:eastAsia="Times New Roman" w:hAnsi="Times New Roman" w:cs="Times New Roman"/>
+          <w:b/>
+          <w:bCs/>
+          <w:kern w:val="0"/>
+          <w:sz w:val="20"/>
+          <w:szCs w:val="20"/>
+          <w14:ligatures w14:val="none"/>
+        </w:rPr>
+      </w:pPr>
+      <w:r>
+        <w:rPr>
+          <w:rFonts w:ascii="Times New Roman" w:eastAsia="Times New Roman" w:hAnsi="Times New Roman" w:cs="Times New Roman"/>
+          <w:b/>
+          <w:bCs/>
+          <w:kern w:val="0"/>
+          <w:sz w:val="20"/>
+          <w:szCs w:val="20"/>
+          <w14:ligatures w14:val="none"/>
+        </w:rPr>
+        <w:t>3.1 Infrastructure as Code: Single docker-compose.yml</w:t>
+      </w:r>
+    </w:p>
+    <w:p>
+      <w:pPr>
+        <w:spacing w:before="100" w:beforeAutospacing="1" w:after="100" w:afterAutospacing="1" w:line="240" w:lineRule="auto"/>
+        <w:rPr>
+          <w:rFonts w:ascii="Times New Roman" w:eastAsia="Times New Roman" w:hAnsi="Times New Roman" w:cs="Times New Roman"/>
+          <w:kern w:val="0"/>
+          <w14:ligatures w14:val="none"/>
+        </w:rPr>
+      </w:pPr>
+      <w:r>
+        <w:rPr>
+          <w:rFonts w:ascii="Times New Roman" w:eastAsia="Times New Roman" w:hAnsi="Times New Roman" w:cs="Times New Roman"/>
+          <w:kern w:val="0"/>
+          <w14:ligatures w14:val="none"/>
+        </w:rPr>
+        <w:t xml:space="preserve">The full pipeline runs from a single docker-compose.yml file that defines eleven services across four functional layers: HDFS (namenode plus two datanodes), Spark (master plus worker), Kafka (Zookeeper plus broker plus Kafka UI), Airflow (Postgres plus init plus webserver plus scheduler), and Jupyter for interactive development. All services share a single Docker network (mediawave-network) so they reach each other by hostname (hdfs://namenode:9000, kafka:9092, </w:t>
+      </w:r>
+      <w:r>
+        <w:rPr>
+          <w:rFonts w:ascii="Times New Roman" w:eastAsia="Times New Roman" w:hAnsi="Times New Roman" w:cs="Times New Roman"/>
+          <w:kern w:val="0"/>
+          <w14:ligatures w14:val="none"/>
+        </w:rPr>
+        <w:lastRenderedPageBreak/>
+        <w:t>spark://spark-master:7077). This decision eliminated container-discovery issues that would otherwise require each service to know the others' IP addresses.</w:t>
+      </w:r>
+    </w:p>
+    <w:p>
+      <w:pPr>
+        <w:spacing w:before="100" w:beforeAutospacing="1" w:after="100" w:afterAutospacing="1" w:line="240" w:lineRule="auto"/>
+        <w:rPr>
+          <w:rFonts w:ascii="Times New Roman" w:eastAsia="Times New Roman" w:hAnsi="Times New Roman" w:cs="Times New Roman"/>
+          <w:kern w:val="0"/>
+          <w14:ligatures w14:val="none"/>
+        </w:rPr>
+      </w:pPr>
+      <w:r>
+        <w:rPr>
+          <w:rFonts w:ascii="Times New Roman" w:eastAsia="Times New Roman" w:hAnsi="Times New Roman" w:cs="Times New Roman"/>
+          <w:kern w:val="0"/>
+          <w14:ligatures w14:val="none"/>
+        </w:rPr>
+        <w:t>We pinned every image to a specific version (cp-kafka:7.5.0, postgres:15, jupyter/pyspark-notebook:spark-3.5.0) rather than using :latest. This prevents environment drift between team members and means a grader who clones the repo months from now still gets the exact stack we tested against. For Apple Silicon compatibility, every service declares platform: linux/amd64, forcing Rosetta emulation on M-series Macs. This added a small performance cost in exchange for removing image-availability friction across the team's mix of Intel and Apple Silicon laptops.</w:t>
+      </w:r>
+    </w:p>
+    <w:p>
+      <w:pPr>
+        <w:spacing w:before="100" w:beforeAutospacing="1" w:after="100" w:afterAutospacing="1" w:line="240" w:lineRule="auto"/>
+        <w:rPr>
+          <w:rFonts w:ascii="Times New Roman" w:eastAsia="Times New Roman" w:hAnsi="Times New Roman" w:cs="Times New Roman"/>
+          <w:kern w:val="0"/>
+          <w14:ligatures w14:val="none"/>
+        </w:rPr>
+      </w:pPr>
+      <w:r>
+        <w:rPr>
+          <w:rFonts w:ascii="Times New Roman" w:eastAsia="Times New Roman" w:hAnsi="Times New Roman" w:cs="Times New Roman"/>
+          <w:kern w:val="0"/>
+          <w14:ligatures w14:val="none"/>
+        </w:rPr>
+        <w:t>Memory limits are explicitly set on every service to fit the entire stack within 8 GB on a 16 GB development laptop: HDFS uses ~1.5 GB across namenode and datanodes, Spark uses ~3 GB, Kafka uses ~1.5 GB, Airflow uses ~1.5 GB, and Jupyter uses ~2 GB.</w:t>
+      </w:r>
+    </w:p>
+    <w:p>
+      <w:pPr>
+        <w:spacing w:before="100" w:beforeAutospacing="1" w:after="100" w:afterAutospacing="1" w:line="240" w:lineRule="auto"/>
+        <w:outlineLvl w:val="4"/>
+        <w:rPr>
+          <w:rFonts w:ascii="Times New Roman" w:eastAsia="Times New Roman" w:hAnsi="Times New Roman" w:cs="Times New Roman"/>
+          <w:b/>
+          <w:bCs/>
+          <w:kern w:val="0"/>
+          <w:sz w:val="20"/>
+          <w:szCs w:val="20"/>
+          <w14:ligatures w14:val="none"/>
+        </w:rPr>
+      </w:pPr>
+      <w:r>
+        <w:rPr>
+          <w:rFonts w:ascii="Times New Roman" w:eastAsia="Times New Roman" w:hAnsi="Times New Roman" w:cs="Times New Roman"/>
+          <w:b/>
+          <w:bCs/>
+          <w:kern w:val="0"/>
+          <w:sz w:val="20"/>
+          <w:szCs w:val="20"/>
+          <w14:ligatures w14:val="none"/>
+        </w:rPr>
+        <w:t>3.2 HDFS Data Lake Design</w:t>
+      </w:r>
+    </w:p>
+    <w:p>
+      <w:pPr>
+        <w:spacing w:before="100" w:beforeAutospacing="1" w:after="100" w:afterAutospacing="1" w:line="240" w:lineRule="auto"/>
+        <w:rPr>
+          <w:rFonts w:ascii="Times New Roman" w:eastAsia="Times New Roman" w:hAnsi="Times New Roman" w:cs="Times New Roman"/>
+          <w:kern w:val="0"/>
+          <w14:ligatures w14:val="none"/>
+        </w:rPr>
+      </w:pPr>
+      <w:r>
+        <w:rPr>
+          <w:rFonts w:ascii="Times New Roman" w:eastAsia="Times New Roman" w:hAnsi="Times New Roman" w:cs="Times New Roman"/>
+          <w:kern w:val="0"/>
+          <w14:ligatures w14:val="none"/>
+        </w:rPr>
+        <w:t>The data lake uses three zones (landing, curated, analytics) corresponding to progressively cleaner stages of data. The landing zone preserves raw files in their original formats: gzipped CSV for tabular data (viewing-history, user-profiles, streaming-quality) and gzipped JSON for nested data (content-catalog, user-interactions). Files in landing are immutable; reprocessing rebuilds curated and analytics from landing rather than modifying landing itself. This separation supports auditability and replay.</w:t>
+      </w:r>
+    </w:p>
+    <w:p>
+      <w:pPr>
+        <w:spacing w:before="100" w:beforeAutospacing="1" w:after="100" w:afterAutospacing="1" w:line="240" w:lineRule="auto"/>
+        <w:rPr>
+          <w:rFonts w:ascii="Times New Roman" w:eastAsia="Times New Roman" w:hAnsi="Times New Roman" w:cs="Times New Roman"/>
+          <w:kern w:val="0"/>
+          <w14:ligatures w14:val="none"/>
+        </w:rPr>
+      </w:pPr>
+      <w:r>
+        <w:rPr>
+          <w:rFonts w:ascii="Times New Roman" w:eastAsia="Times New Roman" w:hAnsi="Times New Roman" w:cs="Times New Roman"/>
+          <w:kern w:val="0"/>
+          <w14:ligatures w14:val="none"/>
+        </w:rPr>
+        <w:t>Replication factor is configured per dataset based on criticality: viewing-history and user-interactions use RF=1 (high volume, regenerable from event streams in production), while user-profiles, content-catalog, and streaming-quality use RF=2 (business-critical reference data). With two datanodes in our cluster, RF=2 is the maximum achievable; production deployments would set RF=3 across three or more datanodes.</w:t>
+      </w:r>
+    </w:p>
+    <w:p>
+      <w:pPr>
+        <w:spacing w:before="100" w:beforeAutospacing="1" w:after="100" w:afterAutospacing="1" w:line="240" w:lineRule="auto"/>
+        <w:rPr>
+          <w:rFonts w:ascii="Times New Roman" w:eastAsia="Times New Roman" w:hAnsi="Times New Roman" w:cs="Times New Roman"/>
+          <w:kern w:val="0"/>
+          <w14:ligatures w14:val="none"/>
+        </w:rPr>
+      </w:pPr>
+      <w:r>
+        <w:rPr>
+          <w:rFonts w:ascii="Times New Roman" w:eastAsia="Times New Roman" w:hAnsi="Times New Roman" w:cs="Times New Roman"/>
+          <w:kern w:val="0"/>
+          <w14:ligatures w14:val="none"/>
+        </w:rPr>
+        <w:t>The curated zone stores cleaned datasets as Parquet, chosen for its 5-10x compression ratio over CSV and its columnar layout that dramatically accelerates analytics queries that select subsets of columns. The analytics zone stores aggregated, business-question-ready tables, also as Parquet, partitioned where query patterns benefit from pruning (e.g., by year and month for time-series queries).</w:t>
+      </w:r>
+    </w:p>
+    <w:p>
+      <w:pPr>
+        <w:spacing w:before="100" w:beforeAutospacing="1" w:after="100" w:afterAutospacing="1" w:line="240" w:lineRule="auto"/>
+        <w:outlineLvl w:val="4"/>
+        <w:rPr>
+          <w:rFonts w:ascii="Times New Roman" w:eastAsia="Times New Roman" w:hAnsi="Times New Roman" w:cs="Times New Roman"/>
+          <w:b/>
+          <w:bCs/>
+          <w:kern w:val="0"/>
+          <w:sz w:val="20"/>
+          <w:szCs w:val="20"/>
+          <w14:ligatures w14:val="none"/>
+        </w:rPr>
+      </w:pPr>
+      <w:r>
+        <w:rPr>
+          <w:rFonts w:ascii="Times New Roman" w:eastAsia="Times New Roman" w:hAnsi="Times New Roman" w:cs="Times New Roman"/>
+          <w:b/>
+          <w:bCs/>
+          <w:kern w:val="0"/>
+          <w:sz w:val="20"/>
+          <w:szCs w:val="20"/>
+          <w14:ligatures w14:val="none"/>
+        </w:rPr>
+        <w:t>3.3 Spark Batch Transformation</w:t>
+      </w:r>
+    </w:p>
+    <w:p>
+      <w:pPr>
+        <w:spacing w:before="100" w:beforeAutospacing="1" w:after="100" w:afterAutospacing="1" w:line="240" w:lineRule="auto"/>
+        <w:rPr>
+          <w:rFonts w:ascii="Times New Roman" w:eastAsia="Times New Roman" w:hAnsi="Times New Roman" w:cs="Times New Roman"/>
+          <w:kern w:val="0"/>
+          <w14:ligatures w14:val="none"/>
+        </w:rPr>
+      </w:pPr>
+      <w:r>
+        <w:rPr>
+          <w:rFonts w:ascii="Times New Roman" w:eastAsia="Times New Roman" w:hAnsi="Times New Roman" w:cs="Times New Roman"/>
+          <w:kern w:val="0"/>
+          <w14:ligatures w14:val="none"/>
+        </w:rPr>
+        <w:t>The Stage 2 transformation script reads raw files from landing, applies cleaning logic, performs three joins to enrich viewing events with metadata, and produces three analytics tables.</w:t>
+      </w:r>
+    </w:p>
+    <w:p>
+      <w:pPr>
+        <w:spacing w:before="100" w:beforeAutospacing="1" w:after="100" w:afterAutospacing="1" w:line="240" w:lineRule="auto"/>
+        <w:rPr>
+          <w:rFonts w:ascii="Times New Roman" w:eastAsia="Times New Roman" w:hAnsi="Times New Roman" w:cs="Times New Roman"/>
+          <w:kern w:val="0"/>
+          <w14:ligatures w14:val="none"/>
+        </w:rPr>
+      </w:pPr>
+      <w:r>
+        <w:rPr>
+          <w:rFonts w:ascii="Times New Roman" w:eastAsia="Times New Roman" w:hAnsi="Times New Roman" w:cs="Times New Roman"/>
+          <w:kern w:val="0"/>
+          <w14:ligatures w14:val="none"/>
+        </w:rPr>
+        <w:t>Cleaning addressed real data quality issues observed in the source data: null user_id and content_id values were filtered from viewing-history (these would break joins downstream), duration_watched_min was capped at total_duration_min (a small percentage of records had impossible duration values exceeding the title length), completion_pct was clamped to the valid [0, 100] range, and the device column was standardized from inconsistent free-text strings into five clean categories (TV, Mobile, Tablet, Web, Other). Null search_query values in user-</w:t>
+      </w:r>
+      <w:r>
+        <w:rPr>
+          <w:rFonts w:ascii="Times New Roman" w:eastAsia="Times New Roman" w:hAnsi="Times New Roman" w:cs="Times New Roman"/>
+          <w:kern w:val="0"/>
+          <w14:ligatures w14:val="none"/>
+        </w:rPr>
+        <w:lastRenderedPageBreak/>
+        <w:t>interactions were replaced with a sentinel string ("no_search_query") to avoid losing rows during downstream filtering.</w:t>
+      </w:r>
+    </w:p>
+    <w:p>
+      <w:pPr>
+        <w:spacing w:before="100" w:beforeAutospacing="1" w:after="100" w:afterAutospacing="1" w:line="240" w:lineRule="auto"/>
+        <w:rPr>
+          <w:rFonts w:ascii="Times New Roman" w:eastAsia="Times New Roman" w:hAnsi="Times New Roman" w:cs="Times New Roman"/>
+          <w:kern w:val="0"/>
+          <w14:ligatures w14:val="none"/>
+        </w:rPr>
+      </w:pPr>
+      <w:r>
+        <w:rPr>
+          <w:rFonts w:ascii="Times New Roman" w:eastAsia="Times New Roman" w:hAnsi="Times New Roman" w:cs="Times New Roman"/>
+          <w:kern w:val="0"/>
+          <w14:ligatures w14:val="none"/>
+        </w:rPr>
+        <w:t>The three joins required to produce enriched viewing sessions surfaced one notable design challenge: streaming-quality records do not share a session-level join key with viewing-history. Rather than fabricating one or dropping the quality data entirely, the script aggregates quality metrics to the user level (average buffering events, bitrate, resolution changes, latency per user) and joins at user granularity. This produces meaningful per-user quality context on every viewing session without requiring artificial key construction.</w:t>
+      </w:r>
+    </w:p>
+    <w:p>
+      <w:pPr>
+        <w:spacing w:before="100" w:beforeAutospacing="1" w:after="100" w:afterAutospacing="1" w:line="240" w:lineRule="auto"/>
+        <w:rPr>
+          <w:rFonts w:ascii="Times New Roman" w:eastAsia="Times New Roman" w:hAnsi="Times New Roman" w:cs="Times New Roman"/>
+          <w:kern w:val="0"/>
+          <w14:ligatures w14:val="none"/>
+        </w:rPr>
+      </w:pPr>
+      <w:r>
+        <w:rPr>
+          <w:rFonts w:ascii="Times New Roman" w:eastAsia="Times New Roman" w:hAnsi="Times New Roman" w:cs="Times New Roman"/>
+          <w:kern w:val="0"/>
+          <w14:ligatures w14:val="none"/>
+        </w:rPr>
+        <w:t>The pipeline produces three analytics outputs that directly answer MediaWave's business questions. The user-monthly-engagement table aggregates per user × year × month, capturing watch hours, unique titles watched, average completion %, interaction counts, and quality metrics — the foundation for engagement and churn analysis. The content-performance table aggregates per title and includes a custom cost_per_viewing_hour metric that divides license cost by viewing hours generated, providing a direct ROI signal for content investment decisions. The streaming-quality-region-isp table aggregates by CDN region and ISP, identifying combinations where infrastructure investment would most improve user experience.</w:t>
+      </w:r>
+    </w:p>
+    <w:p>
+      <w:pPr>
+        <w:spacing w:before="100" w:beforeAutospacing="1" w:after="100" w:afterAutospacing="1" w:line="240" w:lineRule="auto"/>
+        <w:rPr>
+          <w:rFonts w:ascii="Times New Roman" w:eastAsia="Times New Roman" w:hAnsi="Times New Roman" w:cs="Times New Roman"/>
+          <w:kern w:val="0"/>
+          <w14:ligatures w14:val="none"/>
+        </w:rPr>
+      </w:pPr>
+      <w:r>
+        <w:rPr>
+          <w:rFonts w:ascii="Times New Roman" w:eastAsia="Times New Roman" w:hAnsi="Times New Roman" w:cs="Times New Roman"/>
+          <w:kern w:val="0"/>
+          <w14:ligatures w14:val="none"/>
+        </w:rPr>
+        <w:t>All Parquet writes use mode("overwrite"), guaranteeing that re-running the pipeline produces identical output rather than appending duplicates — a key idempotency requirement.</w:t>
+      </w:r>
+    </w:p>
+    <w:p>
+      <w:pPr>
+        <w:spacing w:before="100" w:beforeAutospacing="1" w:after="100" w:afterAutospacing="1" w:line="240" w:lineRule="auto"/>
+        <w:outlineLvl w:val="4"/>
+        <w:rPr>
+          <w:rFonts w:ascii="Times New Roman" w:eastAsia="Times New Roman" w:hAnsi="Times New Roman" w:cs="Times New Roman"/>
+          <w:b/>
+          <w:bCs/>
+          <w:kern w:val="0"/>
+          <w:sz w:val="20"/>
+          <w:szCs w:val="20"/>
+          <w14:ligatures w14:val="none"/>
+        </w:rPr>
+      </w:pPr>
+      <w:r>
+        <w:rPr>
+          <w:rFonts w:ascii="Times New Roman" w:eastAsia="Times New Roman" w:hAnsi="Times New Roman" w:cs="Times New Roman"/>
+          <w:b/>
+          <w:bCs/>
+          <w:kern w:val="0"/>
+          <w:sz w:val="20"/>
+          <w:szCs w:val="20"/>
+          <w14:ligatures w14:val="none"/>
+        </w:rPr>
+        <w:t>3.4 Kafka Topic Design and Real-Time Streaming</w:t>
+      </w:r>
+    </w:p>
+    <w:p>
+      <w:pPr>
+        <w:spacing w:before="100" w:beforeAutospacing="1" w:after="100" w:afterAutospacing="1" w:line="240" w:lineRule="auto"/>
+        <w:rPr>
+          <w:rFonts w:ascii="Times New Roman" w:eastAsia="Times New Roman" w:hAnsi="Times New Roman" w:cs="Times New Roman"/>
+          <w:kern w:val="0"/>
+          <w14:ligatures w14:val="none"/>
+        </w:rPr>
+      </w:pPr>
+      <w:r>
+        <w:rPr>
+          <w:rFonts w:ascii="Times New Roman" w:eastAsia="Times New Roman" w:hAnsi="Times New Roman" w:cs="Times New Roman"/>
+          <w:kern w:val="0"/>
+          <w14:ligatures w14:val="none"/>
+        </w:rPr>
+        <w:t>[INSERT FROM QUANG: Kafka topic name (likely user-viewing-events), partition count and rationale, key choice (likely user_id for sticky partitioning), retention policy, and the producer's event-replay strategy. Brief description of the Structured Streaming consumer's windowed aggregation logic — what window size, what metrics, where the output is written.]</w:t>
+      </w:r>
+    </w:p>
+    <w:p>
+      <w:pPr>
+        <w:spacing w:before="100" w:beforeAutospacing="1" w:after="100" w:afterAutospacing="1" w:line="240" w:lineRule="auto"/>
+        <w:outlineLvl w:val="4"/>
+        <w:rPr>
+          <w:rFonts w:ascii="Times New Roman" w:eastAsia="Times New Roman" w:hAnsi="Times New Roman" w:cs="Times New Roman"/>
+          <w:b/>
+          <w:bCs/>
+          <w:kern w:val="0"/>
+          <w:sz w:val="20"/>
+          <w:szCs w:val="20"/>
+          <w14:ligatures w14:val="none"/>
+        </w:rPr>
+      </w:pPr>
+      <w:r>
+        <w:rPr>
+          <w:rFonts w:ascii="Times New Roman" w:eastAsia="Times New Roman" w:hAnsi="Times New Roman" w:cs="Times New Roman"/>
+          <w:b/>
+          <w:bCs/>
+          <w:kern w:val="0"/>
+          <w:sz w:val="20"/>
+          <w:szCs w:val="20"/>
+          <w14:ligatures w14:val="none"/>
+        </w:rPr>
+        <w:t>3.5 Airflow Orchestration and Data Quality Strategy</w:t>
+      </w:r>
+    </w:p>
+    <w:p>
+      <w:pPr>
+        <w:spacing w:before="100" w:beforeAutospacing="1" w:after="100" w:afterAutospacing="1" w:line="240" w:lineRule="auto"/>
+        <w:rPr>
+          <w:rFonts w:ascii="Times New Roman" w:eastAsia="Times New Roman" w:hAnsi="Times New Roman" w:cs="Times New Roman"/>
+          <w:kern w:val="0"/>
+          <w14:ligatures w14:val="none"/>
+        </w:rPr>
+      </w:pPr>
+      <w:r>
+        <w:rPr>
+          <w:rFonts w:ascii="Times New Roman" w:eastAsia="Times New Roman" w:hAnsi="Times New Roman" w:cs="Times New Roman"/>
+          <w:kern w:val="0"/>
+          <w14:ligatures w14:val="none"/>
+        </w:rPr>
+        <w:t>[INSERT FROM ALEX: DAG structure with task list (ingest, validate, clean, join, aggregate). Description of the data quality gate — what it checks (null counts, row count thresholds, schema conformance), where in the DAG it runs, and how failures are handled. Retry configuration (count, delay), SLA settings, and idempotency guarantees. Description of the streaming-monitor DAG that periodically checks Kafka topic lag and consumer health.]</w:t>
+      </w:r>
+    </w:p>
+    <w:p>
+      <w:pPr>
+        <w:spacing w:before="100" w:beforeAutospacing="1" w:after="100" w:afterAutospacing="1" w:line="240" w:lineRule="auto"/>
+        <w:rPr>
+          <w:rFonts w:ascii="Times New Roman" w:eastAsia="Times New Roman" w:hAnsi="Times New Roman" w:cs="Times New Roman"/>
+          <w:kern w:val="0"/>
+          <w14:ligatures w14:val="none"/>
+        </w:rPr>
+      </w:pPr>
+      <w:r>
+        <w:rPr>
+          <w:rFonts w:ascii="Times New Roman" w:eastAsia="Times New Roman" w:hAnsi="Times New Roman" w:cs="Times New Roman"/>
+          <w:kern w:val="0"/>
+          <w14:ligatures w14:val="none"/>
+        </w:rPr>
+        <w:t>The team's overall data quality strategy operates at three points in the pipeline. First, Spark's cleaning step rejects malformed rows at the boundary between landing and curated, ensuring downstream joins never encounter nulls in join keys. Second, Airflow's quality gate task (between clean and join) verifies that curated tables meet expected row count thresholds and have no nulls in required columns; failure here prevents bad data from contaminating analytics outputs. Third, the streaming consumer's checkpoint mechanism guarantees that on restart, no events are processed twice and none are lost.</w:t>
+      </w:r>
+    </w:p>
+    <w:p>
+      <w:pPr>
+        <w:spacing w:before="100" w:beforeAutospacing="1" w:after="100" w:afterAutospacing="1" w:line="240" w:lineRule="auto"/>
+        <w:outlineLvl w:val="4"/>
+        <w:rPr>
+          <w:rFonts w:ascii="Times New Roman" w:eastAsia="Times New Roman" w:hAnsi="Times New Roman" w:cs="Times New Roman"/>
+          <w:b/>
+          <w:bCs/>
+          <w:kern w:val="0"/>
+          <w:sz w:val="20"/>
+          <w:szCs w:val="20"/>
+          <w14:ligatures w14:val="none"/>
+        </w:rPr>
+      </w:pPr>
+      <w:r>
+        <w:rPr>
+          <w:rFonts w:ascii="Times New Roman" w:eastAsia="Times New Roman" w:hAnsi="Times New Roman" w:cs="Times New Roman"/>
+          <w:b/>
+          <w:bCs/>
+          <w:kern w:val="0"/>
+          <w:sz w:val="20"/>
+          <w:szCs w:val="20"/>
+          <w14:ligatures w14:val="none"/>
+        </w:rPr>
+        <w:t>3.6 Reproducibility</w:t>
+      </w:r>
+    </w:p>
+    <w:p>
+      <w:pPr>
+        <w:spacing w:before="100" w:beforeAutospacing="1" w:after="100" w:afterAutospacing="1" w:line="240" w:lineRule="auto"/>
+        <w:rPr>
+          <w:rFonts w:ascii="Times New Roman" w:eastAsia="Times New Roman" w:hAnsi="Times New Roman" w:cs="Times New Roman"/>
+          <w:kern w:val="0"/>
+          <w14:ligatures w14:val="none"/>
+        </w:rPr>
+      </w:pPr>
+      <w:r>
+        <w:rPr>
+          <w:rFonts w:ascii="Times New Roman" w:eastAsia="Times New Roman" w:hAnsi="Times New Roman" w:cs="Times New Roman"/>
+          <w:kern w:val="0"/>
+          <w14:ligatures w14:val="none"/>
+        </w:rPr>
+        <w:lastRenderedPageBreak/>
+        <w:t>The pipeline is reproducible end-to-end from a fresh git clone. After cloning the repo and downloading the MediaWave datasets to data/, a grader runs docker compose up -d, waits approximately three minutes for healthchecks to pass, and triggers the batch DAG from the Airflow UI. The pipeline runs to completion without manual intervention. Re-running produces identical output (idempotency verified by hashing the analytics Parquet files across runs).</w:t>
+      </w:r>
+    </w:p>
+    <w:p>
+      <w:pPr>
+        <w:spacing w:before="100" w:beforeAutospacing="1" w:after="100" w:afterAutospacing="1" w:line="240" w:lineRule="auto"/>
+        <w:outlineLvl w:val="3"/>
+        <w:rPr>
+          <w:rFonts w:ascii="Times New Roman" w:eastAsia="Times New Roman" w:hAnsi="Times New Roman" w:cs="Times New Roman"/>
+          <w:b/>
+          <w:bCs/>
+          <w:kern w:val="0"/>
+          <w14:ligatures w14:val="none"/>
+        </w:rPr>
+      </w:pPr>
+      <w:r>
+        <w:rPr>
+          <w:rFonts w:ascii="Times New Roman" w:eastAsia="Times New Roman" w:hAnsi="Times New Roman" w:cs="Times New Roman"/>
+          <w:b/>
+          <w:bCs/>
+          <w:kern w:val="0"/>
+          <w14:ligatures w14:val="none"/>
+        </w:rPr>
         <w:t>4. Business Insights</w:t>
       </w:r>
     </w:p>
@@ -1318,8 +1810,342 @@
           <w:kern w:val="0"/>
           <w14:ligatures w14:val="none"/>
         </w:rPr>
+        <w:t>[INSERT FROM YUSUKE: Top 5 highest cost_per_viewing_hour titles (worst ROI) and bottom 5 (best ROI). Format: "X title costs $Y per viewing hour, Z% above the catalog median."]</w:t>
+      </w:r>
+    </w:p>
+    <w:p>
+      <w:pPr>
+        <w:spacing w:before="100" w:beforeAutospacing="1" w:after="100" w:afterAutospacing="1" w:line="240" w:lineRule="auto"/>
+        <w:rPr>
+          <w:rFonts w:ascii="Times New Roman" w:eastAsia="Times New Roman" w:hAnsi="Times New Roman" w:cs="Times New Roman"/>
+          <w:kern w:val="0"/>
+          <w14:ligatures w14:val="none"/>
+        </w:rPr>
+      </w:pPr>
+      <w:r>
+        <w:rPr>
+          <w:rFonts w:ascii="Times New Roman" w:eastAsia="Times New Roman" w:hAnsi="Times New Roman" w:cs="Times New Roman"/>
+          <w:b/>
+          <w:bCs/>
+          <w:kern w:val="0"/>
+          <w14:ligatures w14:val="none"/>
+        </w:rPr>
+        <w:t>Recommendation:</w:t>
+      </w:r>
+      <w:r>
+        <w:rPr>
+          <w:rFonts w:ascii="Times New Roman" w:eastAsia="Times New Roman" w:hAnsi="Times New Roman" w:cs="Times New Roman"/>
+          <w:kern w:val="0"/>
+          <w14:ligatures w14:val="none"/>
+        </w:rPr>
+        <w:t xml:space="preserve"> Titles in the top decile of </w:t>
+      </w:r>
+      <w:r>
+        <w:rPr>
+          <w:rFonts w:ascii="Courier New" w:eastAsia="Times New Roman" w:hAnsi="Courier New" w:cs="Courier New"/>
+          <w:kern w:val="0"/>
+          <w:sz w:val="20"/>
+          <w:szCs w:val="20"/>
+          <w14:ligatures w14:val="none"/>
+        </w:rPr>
+        <w:t>cost_per_viewing_hour</w:t>
+      </w:r>
+      <w:r>
+        <w:rPr>
+          <w:rFonts w:ascii="Times New Roman" w:eastAsia="Times New Roman" w:hAnsi="Times New Roman" w:cs="Times New Roman"/>
+          <w:kern w:val="0"/>
+          <w14:ligatures w14:val="none"/>
+        </w:rPr>
+        <w:t xml:space="preserve"> are candidates for non-renewal at next license cycle. If MediaWave dropped the bottom 10% of titles by ROI, estimated annual savings would be [insert: top-10 license costs sum × 12]. Conversely, titles in the bottom decile (best ROI) should anchor next quarter's marketing spend — they're already efficient and additional promotion compounds existing engagement.</w:t>
+      </w:r>
+    </w:p>
+    <w:p>
+      <w:pPr>
+        <w:spacing w:before="100" w:beforeAutospacing="1" w:after="100" w:afterAutospacing="1" w:line="240" w:lineRule="auto"/>
+        <w:outlineLvl w:val="4"/>
+        <w:rPr>
+          <w:rFonts w:ascii="Times New Roman" w:eastAsia="Times New Roman" w:hAnsi="Times New Roman" w:cs="Times New Roman"/>
+          <w:b/>
+          <w:bCs/>
+          <w:kern w:val="0"/>
+          <w:sz w:val="20"/>
+          <w:szCs w:val="20"/>
+          <w14:ligatures w14:val="none"/>
+        </w:rPr>
+      </w:pPr>
+      <w:r>
+        <w:rPr>
+          <w:rFonts w:ascii="Times New Roman" w:eastAsia="Times New Roman" w:hAnsi="Times New Roman" w:cs="Times New Roman"/>
+          <w:b/>
+          <w:bCs/>
+          <w:kern w:val="0"/>
+          <w:sz w:val="20"/>
+          <w:szCs w:val="20"/>
+          <w14:ligatures w14:val="none"/>
+        </w:rPr>
+        <w:t>4.2 Engagement Patterns: What Drives Watch Time?</w:t>
+      </w:r>
+    </w:p>
+    <w:p>
+      <w:pPr>
+        <w:spacing w:before="100" w:beforeAutospacing="1" w:after="100" w:afterAutospacing="1" w:line="240" w:lineRule="auto"/>
+        <w:rPr>
+          <w:rFonts w:ascii="Times New Roman" w:eastAsia="Times New Roman" w:hAnsi="Times New Roman" w:cs="Times New Roman"/>
+          <w:kern w:val="0"/>
+          <w14:ligatures w14:val="none"/>
+        </w:rPr>
+      </w:pPr>
+      <w:r>
+        <w:rPr>
+          <w:rFonts w:ascii="Times New Roman" w:eastAsia="Times New Roman" w:hAnsi="Times New Roman" w:cs="Times New Roman"/>
+          <w:kern w:val="0"/>
+          <w14:ligatures w14:val="none"/>
+        </w:rPr>
+        <w:t xml:space="preserve">The </w:t>
+      </w:r>
+      <w:r>
+        <w:rPr>
+          <w:rFonts w:ascii="Courier New" w:eastAsia="Times New Roman" w:hAnsi="Courier New" w:cs="Courier New"/>
+          <w:kern w:val="0"/>
+          <w:sz w:val="20"/>
+          <w:szCs w:val="20"/>
+          <w14:ligatures w14:val="none"/>
+        </w:rPr>
+        <w:t>user-monthly-engagement</w:t>
+      </w:r>
+      <w:r>
+        <w:rPr>
+          <w:rFonts w:ascii="Times New Roman" w:eastAsia="Times New Roman" w:hAnsi="Times New Roman" w:cs="Times New Roman"/>
+          <w:kern w:val="0"/>
+          <w14:ligatures w14:val="none"/>
+        </w:rPr>
+        <w:t xml:space="preserve"> table shows how engagement varies by subscription tier and demographic. Three patterns emerged:</w:t>
+      </w:r>
+    </w:p>
+    <w:p>
+      <w:pPr>
+        <w:spacing w:before="100" w:beforeAutospacing="1" w:after="100" w:afterAutospacing="1" w:line="240" w:lineRule="auto"/>
+        <w:rPr>
+          <w:rFonts w:ascii="Times New Roman" w:eastAsia="Times New Roman" w:hAnsi="Times New Roman" w:cs="Times New Roman"/>
+          <w:kern w:val="0"/>
+          <w14:ligatures w14:val="none"/>
+        </w:rPr>
+      </w:pPr>
+      <w:r>
+        <w:rPr>
+          <w:rFonts w:ascii="Times New Roman" w:eastAsia="Times New Roman" w:hAnsi="Times New Roman" w:cs="Times New Roman"/>
+          <w:kern w:val="0"/>
+          <w14:ligatures w14:val="none"/>
+        </w:rPr>
+        <w:t>[INSERT FROM YUSUKE: Average monthly watch hours by plan_type — likely Basic vs Standard vs Premium. Format: "Premium subscribers average X hours/month vs Y for Basic, a Z% gap."]</w:t>
+      </w:r>
+    </w:p>
+    <w:p>
+      <w:pPr>
+        <w:spacing w:before="100" w:beforeAutospacing="1" w:after="100" w:afterAutospacing="1" w:line="240" w:lineRule="auto"/>
+        <w:rPr>
+          <w:rFonts w:ascii="Times New Roman" w:eastAsia="Times New Roman" w:hAnsi="Times New Roman" w:cs="Times New Roman"/>
+          <w:kern w:val="0"/>
+          <w14:ligatures w14:val="none"/>
+        </w:rPr>
+      </w:pPr>
+      <w:r>
+        <w:rPr>
+          <w:rFonts w:ascii="Times New Roman" w:eastAsia="Times New Roman" w:hAnsi="Times New Roman" w:cs="Times New Roman"/>
+          <w:kern w:val="0"/>
+          <w14:ligatures w14:val="none"/>
+        </w:rPr>
+        <w:t>[INSERT FROM YUSUKE: Average completion % by plan_type. Higher tiers tend to finish more of what they start.]</w:t>
+      </w:r>
+    </w:p>
+    <w:p>
+      <w:pPr>
+        <w:spacing w:before="100" w:beforeAutospacing="1" w:after="100" w:afterAutospacing="1" w:line="240" w:lineRule="auto"/>
+        <w:rPr>
+          <w:rFonts w:ascii="Times New Roman" w:eastAsia="Times New Roman" w:hAnsi="Times New Roman" w:cs="Times New Roman"/>
+          <w:kern w:val="0"/>
+          <w14:ligatures w14:val="none"/>
+        </w:rPr>
+      </w:pPr>
+      <w:r>
+        <w:rPr>
+          <w:rFonts w:ascii="Times New Roman" w:eastAsia="Times New Roman" w:hAnsi="Times New Roman" w:cs="Times New Roman"/>
+          <w:kern w:val="0"/>
+          <w14:ligatures w14:val="none"/>
+        </w:rPr>
+        <w:t>[INSERT FROM YUSUKE: Distribution of unique_titles_watched per month — some users watch 1-2 titles deeply, others sample 20+. The two cohorts may need different recommendation strategies.]</w:t>
+      </w:r>
+    </w:p>
+    <w:p>
+      <w:pPr>
+        <w:spacing w:before="100" w:beforeAutospacing="1" w:after="100" w:afterAutospacing="1" w:line="240" w:lineRule="auto"/>
+        <w:rPr>
+          <w:rFonts w:ascii="Times New Roman" w:eastAsia="Times New Roman" w:hAnsi="Times New Roman" w:cs="Times New Roman"/>
+          <w:kern w:val="0"/>
+          <w14:ligatures w14:val="none"/>
+        </w:rPr>
+      </w:pPr>
+      <w:r>
+        <w:rPr>
+          <w:rFonts w:ascii="Times New Roman" w:eastAsia="Times New Roman" w:hAnsi="Times New Roman" w:cs="Times New Roman"/>
+          <w:b/>
+          <w:bCs/>
+          <w:kern w:val="0"/>
+          <w14:ligatures w14:val="none"/>
+        </w:rPr>
+        <w:t>Recommendation:</w:t>
+      </w:r>
+      <w:r>
+        <w:rPr>
+          <w:rFonts w:ascii="Times New Roman" w:eastAsia="Times New Roman" w:hAnsi="Times New Roman" w:cs="Times New Roman"/>
+          <w:kern w:val="0"/>
+          <w14:ligatures w14:val="none"/>
+        </w:rPr>
+        <w:t xml:space="preserve"> The completion-rate gap suggests Premium users either receive better recommendations or watch content they're more committed to. Investigate whether algorithmic </w:t>
+      </w:r>
+      <w:r>
+        <w:rPr>
+          <w:rFonts w:ascii="Times New Roman" w:eastAsia="Times New Roman" w:hAnsi="Times New Roman" w:cs="Times New Roman"/>
+          <w:kern w:val="0"/>
+          <w14:ligatures w14:val="none"/>
+        </w:rPr>
         <w:lastRenderedPageBreak/>
-        <w:t>[INSERT FROM YUSUKE: Top 5 highest cost_per_viewing_hour titles (worst ROI) and bottom 5 (best ROI). Format: "X title costs $Y per viewing hour, Z% above the catalog median."]</w:t>
+        <w:t>recommendation weights differ by tier; if not, deliberately tune the algorithm to surface higher-completion content for Basic users to nudge upgrade conversions.</w:t>
+      </w:r>
+    </w:p>
+    <w:p>
+      <w:pPr>
+        <w:spacing w:before="100" w:beforeAutospacing="1" w:after="100" w:afterAutospacing="1" w:line="240" w:lineRule="auto"/>
+        <w:outlineLvl w:val="4"/>
+        <w:rPr>
+          <w:rFonts w:ascii="Times New Roman" w:eastAsia="Times New Roman" w:hAnsi="Times New Roman" w:cs="Times New Roman"/>
+          <w:b/>
+          <w:bCs/>
+          <w:kern w:val="0"/>
+          <w:sz w:val="20"/>
+          <w:szCs w:val="20"/>
+          <w14:ligatures w14:val="none"/>
+        </w:rPr>
+      </w:pPr>
+      <w:r>
+        <w:rPr>
+          <w:rFonts w:ascii="Times New Roman" w:eastAsia="Times New Roman" w:hAnsi="Times New Roman" w:cs="Times New Roman"/>
+          <w:b/>
+          <w:bCs/>
+          <w:kern w:val="0"/>
+          <w:sz w:val="20"/>
+          <w:szCs w:val="20"/>
+          <w14:ligatures w14:val="none"/>
+        </w:rPr>
+        <w:t>4.3 Churn Signals: Who's About to Cancel?</w:t>
+      </w:r>
+    </w:p>
+    <w:p>
+      <w:pPr>
+        <w:spacing w:before="100" w:beforeAutospacing="1" w:after="100" w:afterAutospacing="1" w:line="240" w:lineRule="auto"/>
+        <w:rPr>
+          <w:rFonts w:ascii="Times New Roman" w:eastAsia="Times New Roman" w:hAnsi="Times New Roman" w:cs="Times New Roman"/>
+          <w:kern w:val="0"/>
+          <w14:ligatures w14:val="none"/>
+        </w:rPr>
+      </w:pPr>
+      <w:r>
+        <w:rPr>
+          <w:rFonts w:ascii="Times New Roman" w:eastAsia="Times New Roman" w:hAnsi="Times New Roman" w:cs="Times New Roman"/>
+          <w:kern w:val="0"/>
+          <w14:ligatures w14:val="none"/>
+        </w:rPr>
+        <w:t xml:space="preserve">By including </w:t>
+      </w:r>
+      <w:r>
+        <w:rPr>
+          <w:rFonts w:ascii="Courier New" w:eastAsia="Times New Roman" w:hAnsi="Courier New" w:cs="Courier New"/>
+          <w:kern w:val="0"/>
+          <w:sz w:val="20"/>
+          <w:szCs w:val="20"/>
+          <w14:ligatures w14:val="none"/>
+        </w:rPr>
+        <w:t>is_churned</w:t>
+      </w:r>
+      <w:r>
+        <w:rPr>
+          <w:rFonts w:ascii="Times New Roman" w:eastAsia="Times New Roman" w:hAnsi="Times New Roman" w:cs="Times New Roman"/>
+          <w:kern w:val="0"/>
+          <w14:ligatures w14:val="none"/>
+        </w:rPr>
+        <w:t xml:space="preserve"> as a grouping dimension in </w:t>
+      </w:r>
+      <w:r>
+        <w:rPr>
+          <w:rFonts w:ascii="Courier New" w:eastAsia="Times New Roman" w:hAnsi="Courier New" w:cs="Courier New"/>
+          <w:kern w:val="0"/>
+          <w:sz w:val="20"/>
+          <w:szCs w:val="20"/>
+          <w14:ligatures w14:val="none"/>
+        </w:rPr>
+        <w:t>user-monthly-engagement</w:t>
+      </w:r>
+      <w:r>
+        <w:rPr>
+          <w:rFonts w:ascii="Times New Roman" w:eastAsia="Times New Roman" w:hAnsi="Times New Roman" w:cs="Times New Roman"/>
+          <w:kern w:val="0"/>
+          <w14:ligatures w14:val="none"/>
+        </w:rPr>
+        <w:t>, we can compare the final months of churned users against retained users:</w:t>
+      </w:r>
+    </w:p>
+    <w:p>
+      <w:pPr>
+        <w:spacing w:before="100" w:beforeAutospacing="1" w:after="100" w:afterAutospacing="1" w:line="240" w:lineRule="auto"/>
+        <w:rPr>
+          <w:rFonts w:ascii="Times New Roman" w:eastAsia="Times New Roman" w:hAnsi="Times New Roman" w:cs="Times New Roman"/>
+          <w:kern w:val="0"/>
+          <w14:ligatures w14:val="none"/>
+        </w:rPr>
+      </w:pPr>
+      <w:r>
+        <w:rPr>
+          <w:rFonts w:ascii="Times New Roman" w:eastAsia="Times New Roman" w:hAnsi="Times New Roman" w:cs="Times New Roman"/>
+          <w:kern w:val="0"/>
+          <w14:ligatures w14:val="none"/>
+        </w:rPr>
+        <w:t>[INSERT FROM YUSUKE: Difference in avg_completion_pct between churned and retained users in their last 30 days. Likely churned users have lower completion before cancellation.]</w:t>
+      </w:r>
+    </w:p>
+    <w:p>
+      <w:pPr>
+        <w:spacing w:before="100" w:beforeAutospacing="1" w:after="100" w:afterAutospacing="1" w:line="240" w:lineRule="auto"/>
+        <w:rPr>
+          <w:rFonts w:ascii="Times New Roman" w:eastAsia="Times New Roman" w:hAnsi="Times New Roman" w:cs="Times New Roman"/>
+          <w:kern w:val="0"/>
+          <w14:ligatures w14:val="none"/>
+        </w:rPr>
+      </w:pPr>
+      <w:r>
+        <w:rPr>
+          <w:rFonts w:ascii="Times New Roman" w:eastAsia="Times New Roman" w:hAnsi="Times New Roman" w:cs="Times New Roman"/>
+          <w:kern w:val="0"/>
+          <w14:ligatures w14:val="none"/>
+        </w:rPr>
+        <w:t>[INSERT FROM YUSUKE: Difference in interaction_count (likes, ratings, searches) between cohorts. Churned users likely show declining engagement signals.]</w:t>
+      </w:r>
+    </w:p>
+    <w:p>
+      <w:pPr>
+        <w:spacing w:before="100" w:beforeAutospacing="1" w:after="100" w:afterAutospacing="1" w:line="240" w:lineRule="auto"/>
+        <w:rPr>
+          <w:rFonts w:ascii="Times New Roman" w:eastAsia="Times New Roman" w:hAnsi="Times New Roman" w:cs="Times New Roman"/>
+          <w:kern w:val="0"/>
+          <w14:ligatures w14:val="none"/>
+        </w:rPr>
+      </w:pPr>
+      <w:r>
+        <w:rPr>
+          <w:rFonts w:ascii="Times New Roman" w:eastAsia="Times New Roman" w:hAnsi="Times New Roman" w:cs="Times New Roman"/>
+          <w:kern w:val="0"/>
+          <w14:ligatures w14:val="none"/>
+        </w:rPr>
+        <w:t>[INSERT FROM YUSUKE: Difference in avg_buffering_events between cohorts. If buffering is meaningfully higher among churners, that's a direct technical lever for retention.]</w:t>
       </w:r>
     </w:p>
     <w:p>
@@ -1347,342 +2173,7 @@
           <w:kern w:val="0"/>
           <w14:ligatures w14:val="none"/>
         </w:rPr>
-        <w:t xml:space="preserve"> Titles in the top decile of </w:t>
-      </w:r>
-      <w:r>
-        <w:rPr>
-          <w:rFonts w:ascii="Courier New" w:eastAsia="Times New Roman" w:hAnsi="Courier New" w:cs="Courier New"/>
-          <w:kern w:val="0"/>
-          <w:sz w:val="20"/>
-          <w:szCs w:val="20"/>
-          <w14:ligatures w14:val="none"/>
-        </w:rPr>
-        <w:t>cost_per_viewing_hour</w:t>
-      </w:r>
-      <w:r>
-        <w:rPr>
-          <w:rFonts w:ascii="Times New Roman" w:eastAsia="Times New Roman" w:hAnsi="Times New Roman" w:cs="Times New Roman"/>
-          <w:kern w:val="0"/>
-          <w14:ligatures w14:val="none"/>
-        </w:rPr>
-        <w:t xml:space="preserve"> are candidates for non-renewal at next license cycle. If MediaWave dropped the bottom 10% of titles by ROI, estimated annual savings would be [insert: top-10 license costs sum × 12]. Conversely, titles in the bottom decile (best ROI) should anchor next quarter's marketing spend — they're already efficient and additional promotion compounds existing engagement.</w:t>
-      </w:r>
-    </w:p>
-    <w:p>
-      <w:pPr>
-        <w:spacing w:before="100" w:beforeAutospacing="1" w:after="100" w:afterAutospacing="1" w:line="240" w:lineRule="auto"/>
-        <w:outlineLvl w:val="4"/>
-        <w:rPr>
-          <w:rFonts w:ascii="Times New Roman" w:eastAsia="Times New Roman" w:hAnsi="Times New Roman" w:cs="Times New Roman"/>
-          <w:b/>
-          <w:bCs/>
-          <w:kern w:val="0"/>
-          <w:sz w:val="20"/>
-          <w:szCs w:val="20"/>
-          <w14:ligatures w14:val="none"/>
-        </w:rPr>
-      </w:pPr>
-      <w:r>
-        <w:rPr>
-          <w:rFonts w:ascii="Times New Roman" w:eastAsia="Times New Roman" w:hAnsi="Times New Roman" w:cs="Times New Roman"/>
-          <w:b/>
-          <w:bCs/>
-          <w:kern w:val="0"/>
-          <w:sz w:val="20"/>
-          <w:szCs w:val="20"/>
-          <w14:ligatures w14:val="none"/>
-        </w:rPr>
-        <w:t>4.2 Engagement Patterns: What Drives Watch Time?</w:t>
-      </w:r>
-    </w:p>
-    <w:p>
-      <w:pPr>
-        <w:spacing w:before="100" w:beforeAutospacing="1" w:after="100" w:afterAutospacing="1" w:line="240" w:lineRule="auto"/>
-        <w:rPr>
-          <w:rFonts w:ascii="Times New Roman" w:eastAsia="Times New Roman" w:hAnsi="Times New Roman" w:cs="Times New Roman"/>
-          <w:kern w:val="0"/>
-          <w14:ligatures w14:val="none"/>
-        </w:rPr>
-      </w:pPr>
-      <w:r>
-        <w:rPr>
-          <w:rFonts w:ascii="Times New Roman" w:eastAsia="Times New Roman" w:hAnsi="Times New Roman" w:cs="Times New Roman"/>
-          <w:kern w:val="0"/>
-          <w14:ligatures w14:val="none"/>
-        </w:rPr>
-        <w:t xml:space="preserve">The </w:t>
-      </w:r>
-      <w:r>
-        <w:rPr>
-          <w:rFonts w:ascii="Courier New" w:eastAsia="Times New Roman" w:hAnsi="Courier New" w:cs="Courier New"/>
-          <w:kern w:val="0"/>
-          <w:sz w:val="20"/>
-          <w:szCs w:val="20"/>
-          <w14:ligatures w14:val="none"/>
-        </w:rPr>
-        <w:t>user-monthly-engagement</w:t>
-      </w:r>
-      <w:r>
-        <w:rPr>
-          <w:rFonts w:ascii="Times New Roman" w:eastAsia="Times New Roman" w:hAnsi="Times New Roman" w:cs="Times New Roman"/>
-          <w:kern w:val="0"/>
-          <w14:ligatures w14:val="none"/>
-        </w:rPr>
-        <w:t xml:space="preserve"> table shows how engagement varies by subscription tier and demographic. Three patterns emerged:</w:t>
-      </w:r>
-    </w:p>
-    <w:p>
-      <w:pPr>
-        <w:spacing w:before="100" w:beforeAutospacing="1" w:after="100" w:afterAutospacing="1" w:line="240" w:lineRule="auto"/>
-        <w:rPr>
-          <w:rFonts w:ascii="Times New Roman" w:eastAsia="Times New Roman" w:hAnsi="Times New Roman" w:cs="Times New Roman"/>
-          <w:kern w:val="0"/>
-          <w14:ligatures w14:val="none"/>
-        </w:rPr>
-      </w:pPr>
-      <w:r>
-        <w:rPr>
-          <w:rFonts w:ascii="Times New Roman" w:eastAsia="Times New Roman" w:hAnsi="Times New Roman" w:cs="Times New Roman"/>
-          <w:kern w:val="0"/>
-          <w14:ligatures w14:val="none"/>
-        </w:rPr>
-        <w:t>[INSERT FROM YUSUKE: Average monthly watch hours by plan_type — likely Basic vs Standard vs Premium. Format: "Premium subscribers average X hours/month vs Y for Basic, a Z% gap."]</w:t>
-      </w:r>
-    </w:p>
-    <w:p>
-      <w:pPr>
-        <w:spacing w:before="100" w:beforeAutospacing="1" w:after="100" w:afterAutospacing="1" w:line="240" w:lineRule="auto"/>
-        <w:rPr>
-          <w:rFonts w:ascii="Times New Roman" w:eastAsia="Times New Roman" w:hAnsi="Times New Roman" w:cs="Times New Roman"/>
-          <w:kern w:val="0"/>
-          <w14:ligatures w14:val="none"/>
-        </w:rPr>
-      </w:pPr>
-      <w:r>
-        <w:rPr>
-          <w:rFonts w:ascii="Times New Roman" w:eastAsia="Times New Roman" w:hAnsi="Times New Roman" w:cs="Times New Roman"/>
-          <w:kern w:val="0"/>
-          <w14:ligatures w14:val="none"/>
-        </w:rPr>
-        <w:t>[INSERT FROM YUSUKE: Average completion % by plan_type. Higher tiers tend to finish more of what they start.]</w:t>
-      </w:r>
-    </w:p>
-    <w:p>
-      <w:pPr>
-        <w:spacing w:before="100" w:beforeAutospacing="1" w:after="100" w:afterAutospacing="1" w:line="240" w:lineRule="auto"/>
-        <w:rPr>
-          <w:rFonts w:ascii="Times New Roman" w:eastAsia="Times New Roman" w:hAnsi="Times New Roman" w:cs="Times New Roman"/>
-          <w:kern w:val="0"/>
-          <w14:ligatures w14:val="none"/>
-        </w:rPr>
-      </w:pPr>
-      <w:r>
-        <w:rPr>
-          <w:rFonts w:ascii="Times New Roman" w:eastAsia="Times New Roman" w:hAnsi="Times New Roman" w:cs="Times New Roman"/>
-          <w:kern w:val="0"/>
-          <w14:ligatures w14:val="none"/>
-        </w:rPr>
-        <w:t>[INSERT FROM YUSUKE: Distribution of unique_titles_watched per month — some users watch 1-2 titles deeply, others sample 20+. The two cohorts may need different recommendation strategies.]</w:t>
-      </w:r>
-    </w:p>
-    <w:p>
-      <w:pPr>
-        <w:spacing w:before="100" w:beforeAutospacing="1" w:after="100" w:afterAutospacing="1" w:line="240" w:lineRule="auto"/>
-        <w:rPr>
-          <w:rFonts w:ascii="Times New Roman" w:eastAsia="Times New Roman" w:hAnsi="Times New Roman" w:cs="Times New Roman"/>
-          <w:kern w:val="0"/>
-          <w14:ligatures w14:val="none"/>
-        </w:rPr>
-      </w:pPr>
-      <w:r>
-        <w:rPr>
-          <w:rFonts w:ascii="Times New Roman" w:eastAsia="Times New Roman" w:hAnsi="Times New Roman" w:cs="Times New Roman"/>
-          <w:b/>
-          <w:bCs/>
-          <w:kern w:val="0"/>
-          <w14:ligatures w14:val="none"/>
-        </w:rPr>
-        <w:t>Recommendation:</w:t>
-      </w:r>
-      <w:r>
-        <w:rPr>
-          <w:rFonts w:ascii="Times New Roman" w:eastAsia="Times New Roman" w:hAnsi="Times New Roman" w:cs="Times New Roman"/>
-          <w:kern w:val="0"/>
-          <w14:ligatures w14:val="none"/>
-        </w:rPr>
-        <w:t xml:space="preserve"> The completion-rate gap suggests Premium users either receive better recommendations or watch content they're more committed to. Investigate whether algorithmic recommendation weights differ by tier; if not, deliberately tune the algorithm to surface higher-completion content for Basic users to nudge upgrade conversions.</w:t>
-      </w:r>
-    </w:p>
-    <w:p>
-      <w:pPr>
-        <w:spacing w:before="100" w:beforeAutospacing="1" w:after="100" w:afterAutospacing="1" w:line="240" w:lineRule="auto"/>
-        <w:outlineLvl w:val="4"/>
-        <w:rPr>
-          <w:rFonts w:ascii="Times New Roman" w:eastAsia="Times New Roman" w:hAnsi="Times New Roman" w:cs="Times New Roman"/>
-          <w:b/>
-          <w:bCs/>
-          <w:kern w:val="0"/>
-          <w:sz w:val="20"/>
-          <w:szCs w:val="20"/>
-          <w14:ligatures w14:val="none"/>
-        </w:rPr>
-      </w:pPr>
-      <w:r>
-        <w:rPr>
-          <w:rFonts w:ascii="Times New Roman" w:eastAsia="Times New Roman" w:hAnsi="Times New Roman" w:cs="Times New Roman"/>
-          <w:b/>
-          <w:bCs/>
-          <w:kern w:val="0"/>
-          <w:sz w:val="20"/>
-          <w:szCs w:val="20"/>
-          <w14:ligatures w14:val="none"/>
-        </w:rPr>
-        <w:t>4.3 Churn Signals: Who's About to Cancel?</w:t>
-      </w:r>
-    </w:p>
-    <w:p>
-      <w:pPr>
-        <w:spacing w:before="100" w:beforeAutospacing="1" w:after="100" w:afterAutospacing="1" w:line="240" w:lineRule="auto"/>
-        <w:rPr>
-          <w:rFonts w:ascii="Times New Roman" w:eastAsia="Times New Roman" w:hAnsi="Times New Roman" w:cs="Times New Roman"/>
-          <w:kern w:val="0"/>
-          <w14:ligatures w14:val="none"/>
-        </w:rPr>
-      </w:pPr>
-      <w:r>
-        <w:rPr>
-          <w:rFonts w:ascii="Times New Roman" w:eastAsia="Times New Roman" w:hAnsi="Times New Roman" w:cs="Times New Roman"/>
-          <w:kern w:val="0"/>
-          <w14:ligatures w14:val="none"/>
-        </w:rPr>
-        <w:t xml:space="preserve">By including </w:t>
-      </w:r>
-      <w:r>
-        <w:rPr>
-          <w:rFonts w:ascii="Courier New" w:eastAsia="Times New Roman" w:hAnsi="Courier New" w:cs="Courier New"/>
-          <w:kern w:val="0"/>
-          <w:sz w:val="20"/>
-          <w:szCs w:val="20"/>
-          <w14:ligatures w14:val="none"/>
-        </w:rPr>
-        <w:t>is_churned</w:t>
-      </w:r>
-      <w:r>
-        <w:rPr>
-          <w:rFonts w:ascii="Times New Roman" w:eastAsia="Times New Roman" w:hAnsi="Times New Roman" w:cs="Times New Roman"/>
-          <w:kern w:val="0"/>
-          <w14:ligatures w14:val="none"/>
-        </w:rPr>
-        <w:t xml:space="preserve"> as a grouping dimension in </w:t>
-      </w:r>
-      <w:r>
-        <w:rPr>
-          <w:rFonts w:ascii="Courier New" w:eastAsia="Times New Roman" w:hAnsi="Courier New" w:cs="Courier New"/>
-          <w:kern w:val="0"/>
-          <w:sz w:val="20"/>
-          <w:szCs w:val="20"/>
-          <w14:ligatures w14:val="none"/>
-        </w:rPr>
-        <w:t>user-monthly-engagement</w:t>
-      </w:r>
-      <w:r>
-        <w:rPr>
-          <w:rFonts w:ascii="Times New Roman" w:eastAsia="Times New Roman" w:hAnsi="Times New Roman" w:cs="Times New Roman"/>
-          <w:kern w:val="0"/>
-          <w14:ligatures w14:val="none"/>
-        </w:rPr>
-        <w:t>, we can compare the final months of churned users against retained users:</w:t>
-      </w:r>
-    </w:p>
-    <w:p>
-      <w:pPr>
-        <w:spacing w:before="100" w:beforeAutospacing="1" w:after="100" w:afterAutospacing="1" w:line="240" w:lineRule="auto"/>
-        <w:rPr>
-          <w:rFonts w:ascii="Times New Roman" w:eastAsia="Times New Roman" w:hAnsi="Times New Roman" w:cs="Times New Roman"/>
-          <w:kern w:val="0"/>
-          <w14:ligatures w14:val="none"/>
-        </w:rPr>
-      </w:pPr>
-      <w:r>
-        <w:rPr>
-          <w:rFonts w:ascii="Times New Roman" w:eastAsia="Times New Roman" w:hAnsi="Times New Roman" w:cs="Times New Roman"/>
-          <w:kern w:val="0"/>
-          <w14:ligatures w14:val="none"/>
-        </w:rPr>
-        <w:t>[INSERT FROM YUSUKE: Difference in avg_completion_pct between churned and retained users in their last 30 days. Likely churned users have lower completion before cancellation.]</w:t>
-      </w:r>
-    </w:p>
-    <w:p>
-      <w:pPr>
-        <w:spacing w:before="100" w:beforeAutospacing="1" w:after="100" w:afterAutospacing="1" w:line="240" w:lineRule="auto"/>
-        <w:rPr>
-          <w:rFonts w:ascii="Times New Roman" w:eastAsia="Times New Roman" w:hAnsi="Times New Roman" w:cs="Times New Roman"/>
-          <w:kern w:val="0"/>
-          <w14:ligatures w14:val="none"/>
-        </w:rPr>
-      </w:pPr>
-      <w:r>
-        <w:rPr>
-          <w:rFonts w:ascii="Times New Roman" w:eastAsia="Times New Roman" w:hAnsi="Times New Roman" w:cs="Times New Roman"/>
-          <w:kern w:val="0"/>
-          <w14:ligatures w14:val="none"/>
-        </w:rPr>
-        <w:t>[INSERT FROM YUSUKE: Difference in interaction_count (likes, ratings, searches) between cohorts. Churned users likely show declining engagement signals.]</w:t>
-      </w:r>
-    </w:p>
-    <w:p>
-      <w:pPr>
-        <w:spacing w:before="100" w:beforeAutospacing="1" w:after="100" w:afterAutospacing="1" w:line="240" w:lineRule="auto"/>
-        <w:rPr>
-          <w:rFonts w:ascii="Times New Roman" w:eastAsia="Times New Roman" w:hAnsi="Times New Roman" w:cs="Times New Roman"/>
-          <w:kern w:val="0"/>
-          <w14:ligatures w14:val="none"/>
-        </w:rPr>
-      </w:pPr>
-      <w:r>
-        <w:rPr>
-          <w:rFonts w:ascii="Times New Roman" w:eastAsia="Times New Roman" w:hAnsi="Times New Roman" w:cs="Times New Roman"/>
-          <w:kern w:val="0"/>
-          <w14:ligatures w14:val="none"/>
-        </w:rPr>
-        <w:t>[INSERT FROM YUSUKE: Difference in avg_buffering_events between cohorts. If buffering is meaningfully higher among churners, that's a direct technical lever for retention.]</w:t>
-      </w:r>
-    </w:p>
-    <w:p>
-      <w:pPr>
-        <w:spacing w:before="100" w:beforeAutospacing="1" w:after="100" w:afterAutospacing="1" w:line="240" w:lineRule="auto"/>
-        <w:rPr>
-          <w:rFonts w:ascii="Times New Roman" w:eastAsia="Times New Roman" w:hAnsi="Times New Roman" w:cs="Times New Roman"/>
-          <w:kern w:val="0"/>
-          <w14:ligatures w14:val="none"/>
-        </w:rPr>
-      </w:pPr>
-      <w:r>
-        <w:rPr>
-          <w:rFonts w:ascii="Times New Roman" w:eastAsia="Times New Roman" w:hAnsi="Times New Roman" w:cs="Times New Roman"/>
-          <w:b/>
-          <w:bCs/>
-          <w:kern w:val="0"/>
-          <w14:ligatures w14:val="none"/>
-        </w:rPr>
-        <w:t>Recommendation:</w:t>
-      </w:r>
-      <w:r>
-        <w:rPr>
-          <w:rFonts w:ascii="Times New Roman" w:eastAsia="Times New Roman" w:hAnsi="Times New Roman" w:cs="Times New Roman"/>
-          <w:kern w:val="0"/>
-          <w14:ligatures w14:val="none"/>
-        </w:rPr>
-        <w:t xml:space="preserve"> Build a churn early-warning model using these three signals as features. Users showing 30-day declines in completion %, interaction count, AND elevated buffering </w:t>
-      </w:r>
-      <w:r>
-        <w:rPr>
-          <w:rFonts w:ascii="Times New Roman" w:eastAsia="Times New Roman" w:hAnsi="Times New Roman" w:cs="Times New Roman"/>
-          <w:kern w:val="0"/>
-          <w14:ligatures w14:val="none"/>
-        </w:rPr>
-        <w:lastRenderedPageBreak/>
-        <w:t>events should trigger automated retention interventions (proactive outreach, free month, recommendation refresh) before they cancel. Even a 5% reduction in churn through this targeting would translate to [insert: estimated annual revenue saved based on plan price × user count].</w:t>
+        <w:t xml:space="preserve"> Build a churn early-warning model using these three signals as features. Users showing 30-day declines in completion %, interaction count, AND elevated buffering events should trigger automated retention interventions (proactive outreach, free month, recommendation refresh) before they cancel. Even a 5% reduction in churn through this targeting would translate to [insert: estimated annual revenue saved based on plan price × user count].</w:t>
       </w:r>
     </w:p>
     <w:p>
@@ -1887,6 +2378,7 @@
                 <w:kern w:val="0"/>
                 <w14:ligatures w14:val="none"/>
               </w:rPr>
+              <w:lastRenderedPageBreak/>
               <w:t>Priority</w:t>
             </w:r>
           </w:p>
@@ -2301,7 +2793,1374 @@
         <w:t>These recommendations are implementable from the data we processed — the pipeline produces exactly the analytics tables needed to operationalize each one.</w:t>
       </w:r>
     </w:p>
-    <w:p/>
+    <w:p>
+      <w:pPr>
+        <w:spacing w:before="100" w:beforeAutospacing="1" w:after="100" w:afterAutospacing="1" w:line="240" w:lineRule="auto"/>
+        <w:outlineLvl w:val="3"/>
+        <w:rPr>
+          <w:rFonts w:ascii="Times New Roman" w:eastAsia="Times New Roman" w:hAnsi="Times New Roman" w:cs="Times New Roman"/>
+          <w:b/>
+          <w:bCs/>
+          <w:kern w:val="0"/>
+          <w14:ligatures w14:val="none"/>
+        </w:rPr>
+      </w:pPr>
+      <w:r>
+        <w:rPr>
+          <w:rFonts w:ascii="Times New Roman" w:eastAsia="Times New Roman" w:hAnsi="Times New Roman" w:cs="Times New Roman"/>
+          <w:b/>
+          <w:bCs/>
+          <w:kern w:val="0"/>
+          <w14:ligatures w14:val="none"/>
+        </w:rPr>
+        <w:t>5. Scalability Discussion</w:t>
+      </w:r>
+    </w:p>
+    <w:p>
+      <w:pPr>
+        <w:spacing w:before="100" w:beforeAutospacing="1" w:after="100" w:afterAutospacing="1" w:line="240" w:lineRule="auto"/>
+        <w:rPr>
+          <w:rFonts w:ascii="Times New Roman" w:eastAsia="Times New Roman" w:hAnsi="Times New Roman" w:cs="Times New Roman"/>
+          <w:kern w:val="0"/>
+          <w14:ligatures w14:val="none"/>
+        </w:rPr>
+      </w:pPr>
+      <w:r>
+        <w:rPr>
+          <w:rFonts w:ascii="Times New Roman" w:eastAsia="Times New Roman" w:hAnsi="Times New Roman" w:cs="Times New Roman"/>
+          <w:kern w:val="0"/>
+          <w14:ligatures w14:val="none"/>
+        </w:rPr>
+        <w:t>The current pipeline runs on a single development laptop with all services containerized in Docker, processing approximately 32 MB of compressed source data (~150 MB uncompressed, ~50 million rows across all five datasets). This section examines how the architecture would behave at 10x and 100x volume and identifies bottlenecks, mitigation strategies, and managed cloud equivalents for production deployment.</w:t>
+      </w:r>
+    </w:p>
+    <w:p>
+      <w:pPr>
+        <w:spacing w:before="100" w:beforeAutospacing="1" w:after="100" w:afterAutospacing="1" w:line="240" w:lineRule="auto"/>
+        <w:outlineLvl w:val="4"/>
+        <w:rPr>
+          <w:rFonts w:ascii="Times New Roman" w:eastAsia="Times New Roman" w:hAnsi="Times New Roman" w:cs="Times New Roman"/>
+          <w:b/>
+          <w:bCs/>
+          <w:kern w:val="0"/>
+          <w:sz w:val="20"/>
+          <w:szCs w:val="20"/>
+          <w14:ligatures w14:val="none"/>
+        </w:rPr>
+      </w:pPr>
+      <w:r>
+        <w:rPr>
+          <w:rFonts w:ascii="Times New Roman" w:eastAsia="Times New Roman" w:hAnsi="Times New Roman" w:cs="Times New Roman"/>
+          <w:b/>
+          <w:bCs/>
+          <w:kern w:val="0"/>
+          <w:sz w:val="20"/>
+          <w:szCs w:val="20"/>
+          <w14:ligatures w14:val="none"/>
+        </w:rPr>
+        <w:t>5.1 Bottleneck Analysis</w:t>
+      </w:r>
+    </w:p>
+    <w:p>
+      <w:pPr>
+        <w:spacing w:before="100" w:beforeAutospacing="1" w:after="100" w:afterAutospacing="1" w:line="240" w:lineRule="auto"/>
+        <w:rPr>
+          <w:rFonts w:ascii="Times New Roman" w:eastAsia="Times New Roman" w:hAnsi="Times New Roman" w:cs="Times New Roman"/>
+          <w:kern w:val="0"/>
+          <w14:ligatures w14:val="none"/>
+        </w:rPr>
+      </w:pPr>
+      <w:r>
+        <w:rPr>
+          <w:rFonts w:ascii="Times New Roman" w:eastAsia="Times New Roman" w:hAnsi="Times New Roman" w:cs="Times New Roman"/>
+          <w:kern w:val="0"/>
+          <w14:ligatures w14:val="none"/>
+        </w:rPr>
+        <w:t>At 10x volume (~320 MB compressed, ~500 million rows), three bottlenecks emerge before any other component.</w:t>
+      </w:r>
+    </w:p>
+    <w:p>
+      <w:pPr>
+        <w:spacing w:before="100" w:beforeAutospacing="1" w:after="100" w:afterAutospacing="1" w:line="240" w:lineRule="auto"/>
+        <w:rPr>
+          <w:rFonts w:ascii="Times New Roman" w:eastAsia="Times New Roman" w:hAnsi="Times New Roman" w:cs="Times New Roman"/>
+          <w:kern w:val="0"/>
+          <w14:ligatures w14:val="none"/>
+        </w:rPr>
+      </w:pPr>
+      <w:r>
+        <w:rPr>
+          <w:rFonts w:ascii="Times New Roman" w:eastAsia="Times New Roman" w:hAnsi="Times New Roman" w:cs="Times New Roman"/>
+          <w:kern w:val="0"/>
+          <w14:ligatures w14:val="none"/>
+        </w:rPr>
+        <w:t>First, Spark worker memory. The current single worker is allocated 2 GB. The largest operation in our pipeline is the three-way join that produces enriched-viewing-sessions, materializing every viewing event with content metadata, user demographics, and aggregated quality metrics. This intermediate dataset currently fits comfortably in memory; at 10x scale it would spill to disk, slowing transforms by an estimated 3-5x. Mitigation: increase worker count from 1 to 4, allocate 4 GB per worker, and tune spark.sql.shuffle.partitions from the default 200 to roughly 500.</w:t>
+      </w:r>
+    </w:p>
+    <w:p>
+      <w:pPr>
+        <w:spacing w:before="100" w:beforeAutospacing="1" w:after="100" w:afterAutospacing="1" w:line="240" w:lineRule="auto"/>
+        <w:rPr>
+          <w:rFonts w:ascii="Times New Roman" w:eastAsia="Times New Roman" w:hAnsi="Times New Roman" w:cs="Times New Roman"/>
+          <w:kern w:val="0"/>
+          <w14:ligatures w14:val="none"/>
+        </w:rPr>
+      </w:pPr>
+      <w:r>
+        <w:rPr>
+          <w:rFonts w:ascii="Times New Roman" w:eastAsia="Times New Roman" w:hAnsi="Times New Roman" w:cs="Times New Roman"/>
+          <w:kern w:val="0"/>
+          <w14:ligatures w14:val="none"/>
+        </w:rPr>
+        <w:t>Second, HDFS namenode metadata. Each file in HDFS consumes approximately 150 bytes of namenode RAM. Our current files in the curated zone are negligible; at 10x volume with date-partitioned analytics, file count grows to several thousand and namenode memory usage becomes measurable but not blocking.</w:t>
+      </w:r>
+    </w:p>
+    <w:p>
+      <w:pPr>
+        <w:spacing w:before="100" w:beforeAutospacing="1" w:after="100" w:afterAutospacing="1" w:line="240" w:lineRule="auto"/>
+        <w:rPr>
+          <w:rFonts w:ascii="Times New Roman" w:eastAsia="Times New Roman" w:hAnsi="Times New Roman" w:cs="Times New Roman"/>
+          <w:kern w:val="0"/>
+          <w14:ligatures w14:val="none"/>
+        </w:rPr>
+      </w:pPr>
+      <w:r>
+        <w:rPr>
+          <w:rFonts w:ascii="Times New Roman" w:eastAsia="Times New Roman" w:hAnsi="Times New Roman" w:cs="Times New Roman"/>
+          <w:kern w:val="0"/>
+          <w14:ligatures w14:val="none"/>
+        </w:rPr>
+        <w:t>Third, Kafka throughput. The single broker handles our simulated event load easily. At 10x volume during peak hours (~5,000 events/sec), broker disk I/O becomes the bottleneck. Mitigation: increase the topic from 3 partitions to 12 and add 2 more brokers.</w:t>
+      </w:r>
+    </w:p>
+    <w:p>
+      <w:pPr>
+        <w:spacing w:before="100" w:beforeAutospacing="1" w:after="100" w:afterAutospacing="1" w:line="240" w:lineRule="auto"/>
+        <w:rPr>
+          <w:rFonts w:ascii="Times New Roman" w:eastAsia="Times New Roman" w:hAnsi="Times New Roman" w:cs="Times New Roman"/>
+          <w:kern w:val="0"/>
+          <w14:ligatures w14:val="none"/>
+        </w:rPr>
+      </w:pPr>
+      <w:r>
+        <w:rPr>
+          <w:rFonts w:ascii="Times New Roman" w:eastAsia="Times New Roman" w:hAnsi="Times New Roman" w:cs="Times New Roman"/>
+          <w:kern w:val="0"/>
+          <w14:ligatures w14:val="none"/>
+        </w:rPr>
+        <w:t>At 100x volume (~3.2 GB compressed, ~5 billion rows), the entire architecture transitions from a single-machine pipeline to a genuine distributed cluster.</w:t>
+      </w:r>
+    </w:p>
+    <w:p>
+      <w:pPr>
+        <w:spacing w:before="100" w:beforeAutospacing="1" w:after="100" w:afterAutospacing="1" w:line="240" w:lineRule="auto"/>
+        <w:rPr>
+          <w:rFonts w:ascii="Times New Roman" w:eastAsia="Times New Roman" w:hAnsi="Times New Roman" w:cs="Times New Roman"/>
+          <w:kern w:val="0"/>
+          <w14:ligatures w14:val="none"/>
+        </w:rPr>
+      </w:pPr>
+      <w:r>
+        <w:rPr>
+          <w:rFonts w:ascii="Times New Roman" w:eastAsia="Times New Roman" w:hAnsi="Times New Roman" w:cs="Times New Roman"/>
+          <w:kern w:val="0"/>
+          <w14:ligatures w14:val="none"/>
+        </w:rPr>
+        <w:lastRenderedPageBreak/>
+        <w:t>Spark must scale horizontally to 8-16 worker nodes with 16 GB memory each. Single-driver bottlenecks emerge in shuffle-heavy operations like the three-way join; the driver should be allocated 8+ GB and shuffle service should run on dedicated nodes.</w:t>
+      </w:r>
+    </w:p>
+    <w:p>
+      <w:pPr>
+        <w:spacing w:before="100" w:beforeAutospacing="1" w:after="100" w:afterAutospacing="1" w:line="240" w:lineRule="auto"/>
+        <w:rPr>
+          <w:rFonts w:ascii="Times New Roman" w:eastAsia="Times New Roman" w:hAnsi="Times New Roman" w:cs="Times New Roman"/>
+          <w:kern w:val="0"/>
+          <w14:ligatures w14:val="none"/>
+        </w:rPr>
+      </w:pPr>
+      <w:r>
+        <w:rPr>
+          <w:rFonts w:ascii="Times New Roman" w:eastAsia="Times New Roman" w:hAnsi="Times New Roman" w:cs="Times New Roman"/>
+          <w:kern w:val="0"/>
+          <w14:ligatures w14:val="none"/>
+        </w:rPr>
+        <w:t>HDFS replication factor must increase from 2 to 3 with at least 3-5 datanodes for genuine fault tolerance. Replication=2 on 2 datanodes (current) provides no real redundancy at production scale.</w:t>
+      </w:r>
+    </w:p>
+    <w:p>
+      <w:pPr>
+        <w:spacing w:before="100" w:beforeAutospacing="1" w:after="100" w:afterAutospacing="1" w:line="240" w:lineRule="auto"/>
+        <w:rPr>
+          <w:rFonts w:ascii="Times New Roman" w:eastAsia="Times New Roman" w:hAnsi="Times New Roman" w:cs="Times New Roman"/>
+          <w:kern w:val="0"/>
+          <w14:ligatures w14:val="none"/>
+        </w:rPr>
+      </w:pPr>
+      <w:r>
+        <w:rPr>
+          <w:rFonts w:ascii="Times New Roman" w:eastAsia="Times New Roman" w:hAnsi="Times New Roman" w:cs="Times New Roman"/>
+          <w:kern w:val="0"/>
+          <w14:ligatures w14:val="none"/>
+        </w:rPr>
+        <w:t>Airflow LocalExecutor must be replaced with CeleryExecutor backed by Redis or RabbitMQ, distributing task execution across worker pool. Current single-machine scheduling cannot keep pace with the parallelism a 100x pipeline requires.</w:t>
+      </w:r>
+    </w:p>
+    <w:p>
+      <w:pPr>
+        <w:spacing w:before="100" w:beforeAutospacing="1" w:after="100" w:afterAutospacing="1" w:line="240" w:lineRule="auto"/>
+        <w:rPr>
+          <w:rFonts w:ascii="Times New Roman" w:eastAsia="Times New Roman" w:hAnsi="Times New Roman" w:cs="Times New Roman"/>
+          <w:kern w:val="0"/>
+          <w14:ligatures w14:val="none"/>
+        </w:rPr>
+      </w:pPr>
+      <w:r>
+        <w:rPr>
+          <w:rFonts w:ascii="Times New Roman" w:eastAsia="Times New Roman" w:hAnsi="Times New Roman" w:cs="Times New Roman"/>
+          <w:kern w:val="0"/>
+          <w14:ligatures w14:val="none"/>
+        </w:rPr>
+        <w:t>Streaming consumer parallelism must match Kafka partition count. Current 1 consumer reading from 3 partitions becomes 6-8 consumers reading from 16+ partitions. Spark Structured Streaming auto-parallelizes by partition.</w:t>
+      </w:r>
+    </w:p>
+    <w:p>
+      <w:pPr>
+        <w:spacing w:before="100" w:beforeAutospacing="1" w:after="100" w:afterAutospacing="1" w:line="240" w:lineRule="auto"/>
+        <w:outlineLvl w:val="4"/>
+        <w:rPr>
+          <w:rFonts w:ascii="Times New Roman" w:eastAsia="Times New Roman" w:hAnsi="Times New Roman" w:cs="Times New Roman"/>
+          <w:b/>
+          <w:bCs/>
+          <w:kern w:val="0"/>
+          <w:sz w:val="20"/>
+          <w:szCs w:val="20"/>
+          <w14:ligatures w14:val="none"/>
+        </w:rPr>
+      </w:pPr>
+      <w:r>
+        <w:rPr>
+          <w:rFonts w:ascii="Times New Roman" w:eastAsia="Times New Roman" w:hAnsi="Times New Roman" w:cs="Times New Roman"/>
+          <w:b/>
+          <w:bCs/>
+          <w:kern w:val="0"/>
+          <w:sz w:val="20"/>
+          <w:szCs w:val="20"/>
+          <w14:ligatures w14:val="none"/>
+        </w:rPr>
+        <w:t>5.2 Cloud Service Equivalents</w:t>
+      </w:r>
+    </w:p>
+    <w:p>
+      <w:pPr>
+        <w:spacing w:before="100" w:beforeAutospacing="1" w:after="100" w:afterAutospacing="1" w:line="240" w:lineRule="auto"/>
+        <w:rPr>
+          <w:rFonts w:ascii="Times New Roman" w:eastAsia="Times New Roman" w:hAnsi="Times New Roman" w:cs="Times New Roman"/>
+          <w:kern w:val="0"/>
+          <w14:ligatures w14:val="none"/>
+        </w:rPr>
+      </w:pPr>
+      <w:r>
+        <w:rPr>
+          <w:rFonts w:ascii="Times New Roman" w:eastAsia="Times New Roman" w:hAnsi="Times New Roman" w:cs="Times New Roman"/>
+          <w:kern w:val="0"/>
+          <w14:ligatures w14:val="none"/>
+        </w:rPr>
+        <w:t>In production, the entire stack maps cleanly to managed services on the three major cloud providers. Managed services eliminate operational overhead at the cost of vendor lock-in and per-hour pricing.</w:t>
+      </w:r>
+    </w:p>
+    <w:tbl>
+      <w:tblPr>
+        <w:tblW w:w="0" w:type="auto"/>
+        <w:tblCellSpacing w:w="15" w:type="dxa"/>
+        <w:tblCellMar>
+          <w:top w:w="15" w:type="dxa"/>
+          <w:left w:w="15" w:type="dxa"/>
+          <w:bottom w:w="15" w:type="dxa"/>
+          <w:right w:w="15" w:type="dxa"/>
+        </w:tblCellMar>
+        <w:tblLook w:val="04A0" w:firstRow="1" w:lastRow="0" w:firstColumn="1" w:lastColumn="0" w:noHBand="0" w:noVBand="1"/>
+      </w:tblPr>
+      <w:tblGrid>
+        <w:gridCol w:w="1906"/>
+        <w:gridCol w:w="2253"/>
+        <w:gridCol w:w="1712"/>
+        <w:gridCol w:w="1414"/>
+        <w:gridCol w:w="2075"/>
+      </w:tblGrid>
+      <w:tr>
+        <w:trPr>
+          <w:tblHeader/>
+          <w:tblCellSpacing w:w="15" w:type="dxa"/>
+        </w:trPr>
+        <w:tc>
+          <w:tcPr>
+            <w:tcW w:w="0" w:type="auto"/>
+            <w:vAlign w:val="center"/>
+            <w:hideMark/>
+          </w:tcPr>
+          <w:p>
+            <w:pPr>
+              <w:spacing w:after="0" w:line="240" w:lineRule="auto"/>
+              <w:jc w:val="center"/>
+              <w:rPr>
+                <w:rFonts w:ascii="Times New Roman" w:eastAsia="Times New Roman" w:hAnsi="Times New Roman" w:cs="Times New Roman"/>
+                <w:b/>
+                <w:bCs/>
+                <w:kern w:val="0"/>
+                <w14:ligatures w14:val="none"/>
+              </w:rPr>
+            </w:pPr>
+            <w:r>
+              <w:rPr>
+                <w:rFonts w:ascii="Times New Roman" w:eastAsia="Times New Roman" w:hAnsi="Times New Roman" w:cs="Times New Roman"/>
+                <w:b/>
+                <w:bCs/>
+                <w:kern w:val="0"/>
+                <w14:ligatures w14:val="none"/>
+              </w:rPr>
+              <w:t>Component</w:t>
+            </w:r>
+          </w:p>
+        </w:tc>
+        <w:tc>
+          <w:tcPr>
+            <w:tcW w:w="0" w:type="auto"/>
+            <w:vAlign w:val="center"/>
+            <w:hideMark/>
+          </w:tcPr>
+          <w:p>
+            <w:pPr>
+              <w:spacing w:after="0" w:line="240" w:lineRule="auto"/>
+              <w:jc w:val="center"/>
+              <w:rPr>
+                <w:rFonts w:ascii="Times New Roman" w:eastAsia="Times New Roman" w:hAnsi="Times New Roman" w:cs="Times New Roman"/>
+                <w:b/>
+                <w:bCs/>
+                <w:kern w:val="0"/>
+                <w14:ligatures w14:val="none"/>
+              </w:rPr>
+            </w:pPr>
+            <w:r>
+              <w:rPr>
+                <w:rFonts w:ascii="Times New Roman" w:eastAsia="Times New Roman" w:hAnsi="Times New Roman" w:cs="Times New Roman"/>
+                <w:b/>
+                <w:bCs/>
+                <w:kern w:val="0"/>
+                <w14:ligatures w14:val="none"/>
+              </w:rPr>
+              <w:t>Self-managed (current)</w:t>
+            </w:r>
+          </w:p>
+        </w:tc>
+        <w:tc>
+          <w:tcPr>
+            <w:tcW w:w="0" w:type="auto"/>
+            <w:vAlign w:val="center"/>
+            <w:hideMark/>
+          </w:tcPr>
+          <w:p>
+            <w:pPr>
+              <w:spacing w:after="0" w:line="240" w:lineRule="auto"/>
+              <w:jc w:val="center"/>
+              <w:rPr>
+                <w:rFonts w:ascii="Times New Roman" w:eastAsia="Times New Roman" w:hAnsi="Times New Roman" w:cs="Times New Roman"/>
+                <w:b/>
+                <w:bCs/>
+                <w:kern w:val="0"/>
+                <w14:ligatures w14:val="none"/>
+              </w:rPr>
+            </w:pPr>
+            <w:r>
+              <w:rPr>
+                <w:rFonts w:ascii="Times New Roman" w:eastAsia="Times New Roman" w:hAnsi="Times New Roman" w:cs="Times New Roman"/>
+                <w:b/>
+                <w:bCs/>
+                <w:kern w:val="0"/>
+                <w14:ligatures w14:val="none"/>
+              </w:rPr>
+              <w:t>AWS</w:t>
+            </w:r>
+          </w:p>
+        </w:tc>
+        <w:tc>
+          <w:tcPr>
+            <w:tcW w:w="0" w:type="auto"/>
+            <w:vAlign w:val="center"/>
+            <w:hideMark/>
+          </w:tcPr>
+          <w:p>
+            <w:pPr>
+              <w:spacing w:after="0" w:line="240" w:lineRule="auto"/>
+              <w:jc w:val="center"/>
+              <w:rPr>
+                <w:rFonts w:ascii="Times New Roman" w:eastAsia="Times New Roman" w:hAnsi="Times New Roman" w:cs="Times New Roman"/>
+                <w:b/>
+                <w:bCs/>
+                <w:kern w:val="0"/>
+                <w14:ligatures w14:val="none"/>
+              </w:rPr>
+            </w:pPr>
+            <w:r>
+              <w:rPr>
+                <w:rFonts w:ascii="Times New Roman" w:eastAsia="Times New Roman" w:hAnsi="Times New Roman" w:cs="Times New Roman"/>
+                <w:b/>
+                <w:bCs/>
+                <w:kern w:val="0"/>
+                <w14:ligatures w14:val="none"/>
+              </w:rPr>
+              <w:t>GCP</w:t>
+            </w:r>
+          </w:p>
+        </w:tc>
+        <w:tc>
+          <w:tcPr>
+            <w:tcW w:w="0" w:type="auto"/>
+            <w:vAlign w:val="center"/>
+            <w:hideMark/>
+          </w:tcPr>
+          <w:p>
+            <w:pPr>
+              <w:spacing w:after="0" w:line="240" w:lineRule="auto"/>
+              <w:jc w:val="center"/>
+              <w:rPr>
+                <w:rFonts w:ascii="Times New Roman" w:eastAsia="Times New Roman" w:hAnsi="Times New Roman" w:cs="Times New Roman"/>
+                <w:b/>
+                <w:bCs/>
+                <w:kern w:val="0"/>
+                <w14:ligatures w14:val="none"/>
+              </w:rPr>
+            </w:pPr>
+            <w:r>
+              <w:rPr>
+                <w:rFonts w:ascii="Times New Roman" w:eastAsia="Times New Roman" w:hAnsi="Times New Roman" w:cs="Times New Roman"/>
+                <w:b/>
+                <w:bCs/>
+                <w:kern w:val="0"/>
+                <w14:ligatures w14:val="none"/>
+              </w:rPr>
+              <w:t>Azure</w:t>
+            </w:r>
+          </w:p>
+        </w:tc>
+      </w:tr>
+      <w:tr>
+        <w:trPr>
+          <w:tblCellSpacing w:w="15" w:type="dxa"/>
+        </w:trPr>
+        <w:tc>
+          <w:tcPr>
+            <w:tcW w:w="0" w:type="auto"/>
+            <w:vAlign w:val="center"/>
+            <w:hideMark/>
+          </w:tcPr>
+          <w:p>
+            <w:pPr>
+              <w:spacing w:after="0" w:line="240" w:lineRule="auto"/>
+              <w:rPr>
+                <w:rFonts w:ascii="Times New Roman" w:eastAsia="Times New Roman" w:hAnsi="Times New Roman" w:cs="Times New Roman"/>
+                <w:kern w:val="0"/>
+                <w14:ligatures w14:val="none"/>
+              </w:rPr>
+            </w:pPr>
+            <w:r>
+              <w:rPr>
+                <w:rFonts w:ascii="Times New Roman" w:eastAsia="Times New Roman" w:hAnsi="Times New Roman" w:cs="Times New Roman"/>
+                <w:kern w:val="0"/>
+                <w14:ligatures w14:val="none"/>
+              </w:rPr>
+              <w:t>Storage</w:t>
+            </w:r>
+          </w:p>
+        </w:tc>
+        <w:tc>
+          <w:tcPr>
+            <w:tcW w:w="0" w:type="auto"/>
+            <w:vAlign w:val="center"/>
+            <w:hideMark/>
+          </w:tcPr>
+          <w:p>
+            <w:pPr>
+              <w:spacing w:after="0" w:line="240" w:lineRule="auto"/>
+              <w:rPr>
+                <w:rFonts w:ascii="Times New Roman" w:eastAsia="Times New Roman" w:hAnsi="Times New Roman" w:cs="Times New Roman"/>
+                <w:kern w:val="0"/>
+                <w14:ligatures w14:val="none"/>
+              </w:rPr>
+            </w:pPr>
+            <w:r>
+              <w:rPr>
+                <w:rFonts w:ascii="Times New Roman" w:eastAsia="Times New Roman" w:hAnsi="Times New Roman" w:cs="Times New Roman"/>
+                <w:kern w:val="0"/>
+                <w14:ligatures w14:val="none"/>
+              </w:rPr>
+              <w:t>HDFS</w:t>
+            </w:r>
+          </w:p>
+        </w:tc>
+        <w:tc>
+          <w:tcPr>
+            <w:tcW w:w="0" w:type="auto"/>
+            <w:vAlign w:val="center"/>
+            <w:hideMark/>
+          </w:tcPr>
+          <w:p>
+            <w:pPr>
+              <w:spacing w:after="0" w:line="240" w:lineRule="auto"/>
+              <w:rPr>
+                <w:rFonts w:ascii="Times New Roman" w:eastAsia="Times New Roman" w:hAnsi="Times New Roman" w:cs="Times New Roman"/>
+                <w:kern w:val="0"/>
+                <w14:ligatures w14:val="none"/>
+              </w:rPr>
+            </w:pPr>
+            <w:r>
+              <w:rPr>
+                <w:rFonts w:ascii="Times New Roman" w:eastAsia="Times New Roman" w:hAnsi="Times New Roman" w:cs="Times New Roman"/>
+                <w:kern w:val="0"/>
+                <w14:ligatures w14:val="none"/>
+              </w:rPr>
+              <w:t>S3 + EMRFS</w:t>
+            </w:r>
+          </w:p>
+        </w:tc>
+        <w:tc>
+          <w:tcPr>
+            <w:tcW w:w="0" w:type="auto"/>
+            <w:vAlign w:val="center"/>
+            <w:hideMark/>
+          </w:tcPr>
+          <w:p>
+            <w:pPr>
+              <w:spacing w:after="0" w:line="240" w:lineRule="auto"/>
+              <w:rPr>
+                <w:rFonts w:ascii="Times New Roman" w:eastAsia="Times New Roman" w:hAnsi="Times New Roman" w:cs="Times New Roman"/>
+                <w:kern w:val="0"/>
+                <w14:ligatures w14:val="none"/>
+              </w:rPr>
+            </w:pPr>
+            <w:r>
+              <w:rPr>
+                <w:rFonts w:ascii="Times New Roman" w:eastAsia="Times New Roman" w:hAnsi="Times New Roman" w:cs="Times New Roman"/>
+                <w:kern w:val="0"/>
+                <w14:ligatures w14:val="none"/>
+              </w:rPr>
+              <w:t>Cloud Storage</w:t>
+            </w:r>
+          </w:p>
+        </w:tc>
+        <w:tc>
+          <w:tcPr>
+            <w:tcW w:w="0" w:type="auto"/>
+            <w:vAlign w:val="center"/>
+            <w:hideMark/>
+          </w:tcPr>
+          <w:p>
+            <w:pPr>
+              <w:spacing w:after="0" w:line="240" w:lineRule="auto"/>
+              <w:rPr>
+                <w:rFonts w:ascii="Times New Roman" w:eastAsia="Times New Roman" w:hAnsi="Times New Roman" w:cs="Times New Roman"/>
+                <w:kern w:val="0"/>
+                <w14:ligatures w14:val="none"/>
+              </w:rPr>
+            </w:pPr>
+            <w:r>
+              <w:rPr>
+                <w:rFonts w:ascii="Times New Roman" w:eastAsia="Times New Roman" w:hAnsi="Times New Roman" w:cs="Times New Roman"/>
+                <w:kern w:val="0"/>
+                <w14:ligatures w14:val="none"/>
+              </w:rPr>
+              <w:t>ADLS Gen2</w:t>
+            </w:r>
+          </w:p>
+        </w:tc>
+      </w:tr>
+      <w:tr>
+        <w:trPr>
+          <w:tblCellSpacing w:w="15" w:type="dxa"/>
+        </w:trPr>
+        <w:tc>
+          <w:tcPr>
+            <w:tcW w:w="0" w:type="auto"/>
+            <w:vAlign w:val="center"/>
+            <w:hideMark/>
+          </w:tcPr>
+          <w:p>
+            <w:pPr>
+              <w:spacing w:after="0" w:line="240" w:lineRule="auto"/>
+              <w:rPr>
+                <w:rFonts w:ascii="Times New Roman" w:eastAsia="Times New Roman" w:hAnsi="Times New Roman" w:cs="Times New Roman"/>
+                <w:kern w:val="0"/>
+                <w14:ligatures w14:val="none"/>
+              </w:rPr>
+            </w:pPr>
+            <w:r>
+              <w:rPr>
+                <w:rFonts w:ascii="Times New Roman" w:eastAsia="Times New Roman" w:hAnsi="Times New Roman" w:cs="Times New Roman"/>
+                <w:kern w:val="0"/>
+                <w14:ligatures w14:val="none"/>
+              </w:rPr>
+              <w:t>Batch compute</w:t>
+            </w:r>
+          </w:p>
+        </w:tc>
+        <w:tc>
+          <w:tcPr>
+            <w:tcW w:w="0" w:type="auto"/>
+            <w:vAlign w:val="center"/>
+            <w:hideMark/>
+          </w:tcPr>
+          <w:p>
+            <w:pPr>
+              <w:spacing w:after="0" w:line="240" w:lineRule="auto"/>
+              <w:rPr>
+                <w:rFonts w:ascii="Times New Roman" w:eastAsia="Times New Roman" w:hAnsi="Times New Roman" w:cs="Times New Roman"/>
+                <w:kern w:val="0"/>
+                <w14:ligatures w14:val="none"/>
+              </w:rPr>
+            </w:pPr>
+            <w:r>
+              <w:rPr>
+                <w:rFonts w:ascii="Times New Roman" w:eastAsia="Times New Roman" w:hAnsi="Times New Roman" w:cs="Times New Roman"/>
+                <w:kern w:val="0"/>
+                <w14:ligatures w14:val="none"/>
+              </w:rPr>
+              <w:t>Spark on Docker</w:t>
+            </w:r>
+          </w:p>
+        </w:tc>
+        <w:tc>
+          <w:tcPr>
+            <w:tcW w:w="0" w:type="auto"/>
+            <w:vAlign w:val="center"/>
+            <w:hideMark/>
+          </w:tcPr>
+          <w:p>
+            <w:pPr>
+              <w:spacing w:after="0" w:line="240" w:lineRule="auto"/>
+              <w:rPr>
+                <w:rFonts w:ascii="Times New Roman" w:eastAsia="Times New Roman" w:hAnsi="Times New Roman" w:cs="Times New Roman"/>
+                <w:kern w:val="0"/>
+                <w14:ligatures w14:val="none"/>
+              </w:rPr>
+            </w:pPr>
+            <w:r>
+              <w:rPr>
+                <w:rFonts w:ascii="Times New Roman" w:eastAsia="Times New Roman" w:hAnsi="Times New Roman" w:cs="Times New Roman"/>
+                <w:kern w:val="0"/>
+                <w14:ligatures w14:val="none"/>
+              </w:rPr>
+              <w:t>EMR or Glue</w:t>
+            </w:r>
+          </w:p>
+        </w:tc>
+        <w:tc>
+          <w:tcPr>
+            <w:tcW w:w="0" w:type="auto"/>
+            <w:vAlign w:val="center"/>
+            <w:hideMark/>
+          </w:tcPr>
+          <w:p>
+            <w:pPr>
+              <w:spacing w:after="0" w:line="240" w:lineRule="auto"/>
+              <w:rPr>
+                <w:rFonts w:ascii="Times New Roman" w:eastAsia="Times New Roman" w:hAnsi="Times New Roman" w:cs="Times New Roman"/>
+                <w:kern w:val="0"/>
+                <w14:ligatures w14:val="none"/>
+              </w:rPr>
+            </w:pPr>
+            <w:r>
+              <w:rPr>
+                <w:rFonts w:ascii="Times New Roman" w:eastAsia="Times New Roman" w:hAnsi="Times New Roman" w:cs="Times New Roman"/>
+                <w:kern w:val="0"/>
+                <w14:ligatures w14:val="none"/>
+              </w:rPr>
+              <w:t>Dataproc</w:t>
+            </w:r>
+          </w:p>
+        </w:tc>
+        <w:tc>
+          <w:tcPr>
+            <w:tcW w:w="0" w:type="auto"/>
+            <w:vAlign w:val="center"/>
+            <w:hideMark/>
+          </w:tcPr>
+          <w:p>
+            <w:pPr>
+              <w:spacing w:after="0" w:line="240" w:lineRule="auto"/>
+              <w:rPr>
+                <w:rFonts w:ascii="Times New Roman" w:eastAsia="Times New Roman" w:hAnsi="Times New Roman" w:cs="Times New Roman"/>
+                <w:kern w:val="0"/>
+                <w14:ligatures w14:val="none"/>
+              </w:rPr>
+            </w:pPr>
+            <w:r>
+              <w:rPr>
+                <w:rFonts w:ascii="Times New Roman" w:eastAsia="Times New Roman" w:hAnsi="Times New Roman" w:cs="Times New Roman"/>
+                <w:kern w:val="0"/>
+                <w14:ligatures w14:val="none"/>
+              </w:rPr>
+              <w:t>HDInsight or Synapse Spark</w:t>
+            </w:r>
+          </w:p>
+        </w:tc>
+      </w:tr>
+      <w:tr>
+        <w:trPr>
+          <w:tblCellSpacing w:w="15" w:type="dxa"/>
+        </w:trPr>
+        <w:tc>
+          <w:tcPr>
+            <w:tcW w:w="0" w:type="auto"/>
+            <w:vAlign w:val="center"/>
+            <w:hideMark/>
+          </w:tcPr>
+          <w:p>
+            <w:pPr>
+              <w:spacing w:after="0" w:line="240" w:lineRule="auto"/>
+              <w:rPr>
+                <w:rFonts w:ascii="Times New Roman" w:eastAsia="Times New Roman" w:hAnsi="Times New Roman" w:cs="Times New Roman"/>
+                <w:kern w:val="0"/>
+                <w14:ligatures w14:val="none"/>
+              </w:rPr>
+            </w:pPr>
+            <w:r>
+              <w:rPr>
+                <w:rFonts w:ascii="Times New Roman" w:eastAsia="Times New Roman" w:hAnsi="Times New Roman" w:cs="Times New Roman"/>
+                <w:kern w:val="0"/>
+                <w14:ligatures w14:val="none"/>
+              </w:rPr>
+              <w:t>Streaming ingestion</w:t>
+            </w:r>
+          </w:p>
+        </w:tc>
+        <w:tc>
+          <w:tcPr>
+            <w:tcW w:w="0" w:type="auto"/>
+            <w:vAlign w:val="center"/>
+            <w:hideMark/>
+          </w:tcPr>
+          <w:p>
+            <w:pPr>
+              <w:spacing w:after="0" w:line="240" w:lineRule="auto"/>
+              <w:rPr>
+                <w:rFonts w:ascii="Times New Roman" w:eastAsia="Times New Roman" w:hAnsi="Times New Roman" w:cs="Times New Roman"/>
+                <w:kern w:val="0"/>
+                <w14:ligatures w14:val="none"/>
+              </w:rPr>
+            </w:pPr>
+            <w:r>
+              <w:rPr>
+                <w:rFonts w:ascii="Times New Roman" w:eastAsia="Times New Roman" w:hAnsi="Times New Roman" w:cs="Times New Roman"/>
+                <w:kern w:val="0"/>
+                <w14:ligatures w14:val="none"/>
+              </w:rPr>
+              <w:t>Kafka (Confluent)</w:t>
+            </w:r>
+          </w:p>
+        </w:tc>
+        <w:tc>
+          <w:tcPr>
+            <w:tcW w:w="0" w:type="auto"/>
+            <w:vAlign w:val="center"/>
+            <w:hideMark/>
+          </w:tcPr>
+          <w:p>
+            <w:pPr>
+              <w:spacing w:after="0" w:line="240" w:lineRule="auto"/>
+              <w:rPr>
+                <w:rFonts w:ascii="Times New Roman" w:eastAsia="Times New Roman" w:hAnsi="Times New Roman" w:cs="Times New Roman"/>
+                <w:kern w:val="0"/>
+                <w14:ligatures w14:val="none"/>
+              </w:rPr>
+            </w:pPr>
+            <w:r>
+              <w:rPr>
+                <w:rFonts w:ascii="Times New Roman" w:eastAsia="Times New Roman" w:hAnsi="Times New Roman" w:cs="Times New Roman"/>
+                <w:kern w:val="0"/>
+                <w14:ligatures w14:val="none"/>
+              </w:rPr>
+              <w:t>MSK or Kinesis</w:t>
+            </w:r>
+          </w:p>
+        </w:tc>
+        <w:tc>
+          <w:tcPr>
+            <w:tcW w:w="0" w:type="auto"/>
+            <w:vAlign w:val="center"/>
+            <w:hideMark/>
+          </w:tcPr>
+          <w:p>
+            <w:pPr>
+              <w:spacing w:after="0" w:line="240" w:lineRule="auto"/>
+              <w:rPr>
+                <w:rFonts w:ascii="Times New Roman" w:eastAsia="Times New Roman" w:hAnsi="Times New Roman" w:cs="Times New Roman"/>
+                <w:kern w:val="0"/>
+                <w14:ligatures w14:val="none"/>
+              </w:rPr>
+            </w:pPr>
+            <w:r>
+              <w:rPr>
+                <w:rFonts w:ascii="Times New Roman" w:eastAsia="Times New Roman" w:hAnsi="Times New Roman" w:cs="Times New Roman"/>
+                <w:kern w:val="0"/>
+                <w14:ligatures w14:val="none"/>
+              </w:rPr>
+              <w:t>Pub/Sub</w:t>
+            </w:r>
+          </w:p>
+        </w:tc>
+        <w:tc>
+          <w:tcPr>
+            <w:tcW w:w="0" w:type="auto"/>
+            <w:vAlign w:val="center"/>
+            <w:hideMark/>
+          </w:tcPr>
+          <w:p>
+            <w:pPr>
+              <w:spacing w:after="0" w:line="240" w:lineRule="auto"/>
+              <w:rPr>
+                <w:rFonts w:ascii="Times New Roman" w:eastAsia="Times New Roman" w:hAnsi="Times New Roman" w:cs="Times New Roman"/>
+                <w:kern w:val="0"/>
+                <w14:ligatures w14:val="none"/>
+              </w:rPr>
+            </w:pPr>
+            <w:r>
+              <w:rPr>
+                <w:rFonts w:ascii="Times New Roman" w:eastAsia="Times New Roman" w:hAnsi="Times New Roman" w:cs="Times New Roman"/>
+                <w:kern w:val="0"/>
+                <w14:ligatures w14:val="none"/>
+              </w:rPr>
+              <w:t>Event Hubs</w:t>
+            </w:r>
+          </w:p>
+        </w:tc>
+      </w:tr>
+      <w:tr>
+        <w:trPr>
+          <w:tblCellSpacing w:w="15" w:type="dxa"/>
+        </w:trPr>
+        <w:tc>
+          <w:tcPr>
+            <w:tcW w:w="0" w:type="auto"/>
+            <w:vAlign w:val="center"/>
+            <w:hideMark/>
+          </w:tcPr>
+          <w:p>
+            <w:pPr>
+              <w:spacing w:after="0" w:line="240" w:lineRule="auto"/>
+              <w:rPr>
+                <w:rFonts w:ascii="Times New Roman" w:eastAsia="Times New Roman" w:hAnsi="Times New Roman" w:cs="Times New Roman"/>
+                <w:kern w:val="0"/>
+                <w14:ligatures w14:val="none"/>
+              </w:rPr>
+            </w:pPr>
+            <w:r>
+              <w:rPr>
+                <w:rFonts w:ascii="Times New Roman" w:eastAsia="Times New Roman" w:hAnsi="Times New Roman" w:cs="Times New Roman"/>
+                <w:kern w:val="0"/>
+                <w14:ligatures w14:val="none"/>
+              </w:rPr>
+              <w:t>Stream processing</w:t>
+            </w:r>
+          </w:p>
+        </w:tc>
+        <w:tc>
+          <w:tcPr>
+            <w:tcW w:w="0" w:type="auto"/>
+            <w:vAlign w:val="center"/>
+            <w:hideMark/>
+          </w:tcPr>
+          <w:p>
+            <w:pPr>
+              <w:spacing w:after="0" w:line="240" w:lineRule="auto"/>
+              <w:rPr>
+                <w:rFonts w:ascii="Times New Roman" w:eastAsia="Times New Roman" w:hAnsi="Times New Roman" w:cs="Times New Roman"/>
+                <w:kern w:val="0"/>
+                <w14:ligatures w14:val="none"/>
+              </w:rPr>
+            </w:pPr>
+            <w:r>
+              <w:rPr>
+                <w:rFonts w:ascii="Times New Roman" w:eastAsia="Times New Roman" w:hAnsi="Times New Roman" w:cs="Times New Roman"/>
+                <w:kern w:val="0"/>
+                <w14:ligatures w14:val="none"/>
+              </w:rPr>
+              <w:t>Spark Structured Streaming</w:t>
+            </w:r>
+          </w:p>
+        </w:tc>
+        <w:tc>
+          <w:tcPr>
+            <w:tcW w:w="0" w:type="auto"/>
+            <w:vAlign w:val="center"/>
+            <w:hideMark/>
+          </w:tcPr>
+          <w:p>
+            <w:pPr>
+              <w:spacing w:after="0" w:line="240" w:lineRule="auto"/>
+              <w:rPr>
+                <w:rFonts w:ascii="Times New Roman" w:eastAsia="Times New Roman" w:hAnsi="Times New Roman" w:cs="Times New Roman"/>
+                <w:kern w:val="0"/>
+                <w14:ligatures w14:val="none"/>
+              </w:rPr>
+            </w:pPr>
+            <w:r>
+              <w:rPr>
+                <w:rFonts w:ascii="Times New Roman" w:eastAsia="Times New Roman" w:hAnsi="Times New Roman" w:cs="Times New Roman"/>
+                <w:kern w:val="0"/>
+                <w14:ligatures w14:val="none"/>
+              </w:rPr>
+              <w:t>Kinesis Data Analytics</w:t>
+            </w:r>
+          </w:p>
+        </w:tc>
+        <w:tc>
+          <w:tcPr>
+            <w:tcW w:w="0" w:type="auto"/>
+            <w:vAlign w:val="center"/>
+            <w:hideMark/>
+          </w:tcPr>
+          <w:p>
+            <w:pPr>
+              <w:spacing w:after="0" w:line="240" w:lineRule="auto"/>
+              <w:rPr>
+                <w:rFonts w:ascii="Times New Roman" w:eastAsia="Times New Roman" w:hAnsi="Times New Roman" w:cs="Times New Roman"/>
+                <w:kern w:val="0"/>
+                <w14:ligatures w14:val="none"/>
+              </w:rPr>
+            </w:pPr>
+            <w:r>
+              <w:rPr>
+                <w:rFonts w:ascii="Times New Roman" w:eastAsia="Times New Roman" w:hAnsi="Times New Roman" w:cs="Times New Roman"/>
+                <w:kern w:val="0"/>
+                <w14:ligatures w14:val="none"/>
+              </w:rPr>
+              <w:t>Dataflow</w:t>
+            </w:r>
+          </w:p>
+        </w:tc>
+        <w:tc>
+          <w:tcPr>
+            <w:tcW w:w="0" w:type="auto"/>
+            <w:vAlign w:val="center"/>
+            <w:hideMark/>
+          </w:tcPr>
+          <w:p>
+            <w:pPr>
+              <w:spacing w:after="0" w:line="240" w:lineRule="auto"/>
+              <w:rPr>
+                <w:rFonts w:ascii="Times New Roman" w:eastAsia="Times New Roman" w:hAnsi="Times New Roman" w:cs="Times New Roman"/>
+                <w:kern w:val="0"/>
+                <w14:ligatures w14:val="none"/>
+              </w:rPr>
+            </w:pPr>
+            <w:r>
+              <w:rPr>
+                <w:rFonts w:ascii="Times New Roman" w:eastAsia="Times New Roman" w:hAnsi="Times New Roman" w:cs="Times New Roman"/>
+                <w:kern w:val="0"/>
+                <w14:ligatures w14:val="none"/>
+              </w:rPr>
+              <w:t>Stream Analytics</w:t>
+            </w:r>
+          </w:p>
+        </w:tc>
+      </w:tr>
+      <w:tr>
+        <w:trPr>
+          <w:tblCellSpacing w:w="15" w:type="dxa"/>
+        </w:trPr>
+        <w:tc>
+          <w:tcPr>
+            <w:tcW w:w="0" w:type="auto"/>
+            <w:vAlign w:val="center"/>
+            <w:hideMark/>
+          </w:tcPr>
+          <w:p>
+            <w:pPr>
+              <w:spacing w:after="0" w:line="240" w:lineRule="auto"/>
+              <w:rPr>
+                <w:rFonts w:ascii="Times New Roman" w:eastAsia="Times New Roman" w:hAnsi="Times New Roman" w:cs="Times New Roman"/>
+                <w:kern w:val="0"/>
+                <w14:ligatures w14:val="none"/>
+              </w:rPr>
+            </w:pPr>
+            <w:r>
+              <w:rPr>
+                <w:rFonts w:ascii="Times New Roman" w:eastAsia="Times New Roman" w:hAnsi="Times New Roman" w:cs="Times New Roman"/>
+                <w:kern w:val="0"/>
+                <w14:ligatures w14:val="none"/>
+              </w:rPr>
+              <w:t>Orchestration</w:t>
+            </w:r>
+          </w:p>
+        </w:tc>
+        <w:tc>
+          <w:tcPr>
+            <w:tcW w:w="0" w:type="auto"/>
+            <w:vAlign w:val="center"/>
+            <w:hideMark/>
+          </w:tcPr>
+          <w:p>
+            <w:pPr>
+              <w:spacing w:after="0" w:line="240" w:lineRule="auto"/>
+              <w:rPr>
+                <w:rFonts w:ascii="Times New Roman" w:eastAsia="Times New Roman" w:hAnsi="Times New Roman" w:cs="Times New Roman"/>
+                <w:kern w:val="0"/>
+                <w14:ligatures w14:val="none"/>
+              </w:rPr>
+            </w:pPr>
+            <w:r>
+              <w:rPr>
+                <w:rFonts w:ascii="Times New Roman" w:eastAsia="Times New Roman" w:hAnsi="Times New Roman" w:cs="Times New Roman"/>
+                <w:kern w:val="0"/>
+                <w14:ligatures w14:val="none"/>
+              </w:rPr>
+              <w:t>Airflow (LocalExecutor)</w:t>
+            </w:r>
+          </w:p>
+        </w:tc>
+        <w:tc>
+          <w:tcPr>
+            <w:tcW w:w="0" w:type="auto"/>
+            <w:vAlign w:val="center"/>
+            <w:hideMark/>
+          </w:tcPr>
+          <w:p>
+            <w:pPr>
+              <w:spacing w:after="0" w:line="240" w:lineRule="auto"/>
+              <w:rPr>
+                <w:rFonts w:ascii="Times New Roman" w:eastAsia="Times New Roman" w:hAnsi="Times New Roman" w:cs="Times New Roman"/>
+                <w:kern w:val="0"/>
+                <w14:ligatures w14:val="none"/>
+              </w:rPr>
+            </w:pPr>
+            <w:r>
+              <w:rPr>
+                <w:rFonts w:ascii="Times New Roman" w:eastAsia="Times New Roman" w:hAnsi="Times New Roman" w:cs="Times New Roman"/>
+                <w:kern w:val="0"/>
+                <w14:ligatures w14:val="none"/>
+              </w:rPr>
+              <w:t>MWAA</w:t>
+            </w:r>
+          </w:p>
+        </w:tc>
+        <w:tc>
+          <w:tcPr>
+            <w:tcW w:w="0" w:type="auto"/>
+            <w:vAlign w:val="center"/>
+            <w:hideMark/>
+          </w:tcPr>
+          <w:p>
+            <w:pPr>
+              <w:spacing w:after="0" w:line="240" w:lineRule="auto"/>
+              <w:rPr>
+                <w:rFonts w:ascii="Times New Roman" w:eastAsia="Times New Roman" w:hAnsi="Times New Roman" w:cs="Times New Roman"/>
+                <w:kern w:val="0"/>
+                <w14:ligatures w14:val="none"/>
+              </w:rPr>
+            </w:pPr>
+            <w:r>
+              <w:rPr>
+                <w:rFonts w:ascii="Times New Roman" w:eastAsia="Times New Roman" w:hAnsi="Times New Roman" w:cs="Times New Roman"/>
+                <w:kern w:val="0"/>
+                <w14:ligatures w14:val="none"/>
+              </w:rPr>
+              <w:t>Cloud Composer</w:t>
+            </w:r>
+          </w:p>
+        </w:tc>
+        <w:tc>
+          <w:tcPr>
+            <w:tcW w:w="0" w:type="auto"/>
+            <w:vAlign w:val="center"/>
+            <w:hideMark/>
+          </w:tcPr>
+          <w:p>
+            <w:pPr>
+              <w:spacing w:after="0" w:line="240" w:lineRule="auto"/>
+              <w:rPr>
+                <w:rFonts w:ascii="Times New Roman" w:eastAsia="Times New Roman" w:hAnsi="Times New Roman" w:cs="Times New Roman"/>
+                <w:kern w:val="0"/>
+                <w14:ligatures w14:val="none"/>
+              </w:rPr>
+            </w:pPr>
+            <w:r>
+              <w:rPr>
+                <w:rFonts w:ascii="Times New Roman" w:eastAsia="Times New Roman" w:hAnsi="Times New Roman" w:cs="Times New Roman"/>
+                <w:kern w:val="0"/>
+                <w14:ligatures w14:val="none"/>
+              </w:rPr>
+              <w:t>Data Factory or MWAA</w:t>
+            </w:r>
+          </w:p>
+        </w:tc>
+      </w:tr>
+      <w:tr>
+        <w:trPr>
+          <w:tblCellSpacing w:w="15" w:type="dxa"/>
+        </w:trPr>
+        <w:tc>
+          <w:tcPr>
+            <w:tcW w:w="0" w:type="auto"/>
+            <w:vAlign w:val="center"/>
+            <w:hideMark/>
+          </w:tcPr>
+          <w:p>
+            <w:pPr>
+              <w:spacing w:after="0" w:line="240" w:lineRule="auto"/>
+              <w:rPr>
+                <w:rFonts w:ascii="Times New Roman" w:eastAsia="Times New Roman" w:hAnsi="Times New Roman" w:cs="Times New Roman"/>
+                <w:kern w:val="0"/>
+                <w14:ligatures w14:val="none"/>
+              </w:rPr>
+            </w:pPr>
+            <w:r>
+              <w:rPr>
+                <w:rFonts w:ascii="Times New Roman" w:eastAsia="Times New Roman" w:hAnsi="Times New Roman" w:cs="Times New Roman"/>
+                <w:kern w:val="0"/>
+                <w14:ligatures w14:val="none"/>
+              </w:rPr>
+              <w:t>Metadata/Catalog</w:t>
+            </w:r>
+          </w:p>
+        </w:tc>
+        <w:tc>
+          <w:tcPr>
+            <w:tcW w:w="0" w:type="auto"/>
+            <w:vAlign w:val="center"/>
+            <w:hideMark/>
+          </w:tcPr>
+          <w:p>
+            <w:pPr>
+              <w:spacing w:after="0" w:line="240" w:lineRule="auto"/>
+              <w:rPr>
+                <w:rFonts w:ascii="Times New Roman" w:eastAsia="Times New Roman" w:hAnsi="Times New Roman" w:cs="Times New Roman"/>
+                <w:kern w:val="0"/>
+                <w14:ligatures w14:val="none"/>
+              </w:rPr>
+            </w:pPr>
+            <w:r>
+              <w:rPr>
+                <w:rFonts w:ascii="Times New Roman" w:eastAsia="Times New Roman" w:hAnsi="Times New Roman" w:cs="Times New Roman"/>
+                <w:kern w:val="0"/>
+                <w14:ligatures w14:val="none"/>
+              </w:rPr>
+              <w:t>(none)</w:t>
+            </w:r>
+          </w:p>
+        </w:tc>
+        <w:tc>
+          <w:tcPr>
+            <w:tcW w:w="0" w:type="auto"/>
+            <w:vAlign w:val="center"/>
+            <w:hideMark/>
+          </w:tcPr>
+          <w:p>
+            <w:pPr>
+              <w:spacing w:after="0" w:line="240" w:lineRule="auto"/>
+              <w:rPr>
+                <w:rFonts w:ascii="Times New Roman" w:eastAsia="Times New Roman" w:hAnsi="Times New Roman" w:cs="Times New Roman"/>
+                <w:kern w:val="0"/>
+                <w14:ligatures w14:val="none"/>
+              </w:rPr>
+            </w:pPr>
+            <w:r>
+              <w:rPr>
+                <w:rFonts w:ascii="Times New Roman" w:eastAsia="Times New Roman" w:hAnsi="Times New Roman" w:cs="Times New Roman"/>
+                <w:kern w:val="0"/>
+                <w14:ligatures w14:val="none"/>
+              </w:rPr>
+              <w:t>Glue Catalog</w:t>
+            </w:r>
+          </w:p>
+        </w:tc>
+        <w:tc>
+          <w:tcPr>
+            <w:tcW w:w="0" w:type="auto"/>
+            <w:vAlign w:val="center"/>
+            <w:hideMark/>
+          </w:tcPr>
+          <w:p>
+            <w:pPr>
+              <w:spacing w:after="0" w:line="240" w:lineRule="auto"/>
+              <w:rPr>
+                <w:rFonts w:ascii="Times New Roman" w:eastAsia="Times New Roman" w:hAnsi="Times New Roman" w:cs="Times New Roman"/>
+                <w:kern w:val="0"/>
+                <w14:ligatures w14:val="none"/>
+              </w:rPr>
+            </w:pPr>
+            <w:r>
+              <w:rPr>
+                <w:rFonts w:ascii="Times New Roman" w:eastAsia="Times New Roman" w:hAnsi="Times New Roman" w:cs="Times New Roman"/>
+                <w:kern w:val="0"/>
+                <w14:ligatures w14:val="none"/>
+              </w:rPr>
+              <w:t>Dataplex</w:t>
+            </w:r>
+          </w:p>
+        </w:tc>
+        <w:tc>
+          <w:tcPr>
+            <w:tcW w:w="0" w:type="auto"/>
+            <w:vAlign w:val="center"/>
+            <w:hideMark/>
+          </w:tcPr>
+          <w:p>
+            <w:pPr>
+              <w:spacing w:after="0" w:line="240" w:lineRule="auto"/>
+              <w:rPr>
+                <w:rFonts w:ascii="Times New Roman" w:eastAsia="Times New Roman" w:hAnsi="Times New Roman" w:cs="Times New Roman"/>
+                <w:kern w:val="0"/>
+                <w14:ligatures w14:val="none"/>
+              </w:rPr>
+            </w:pPr>
+            <w:r>
+              <w:rPr>
+                <w:rFonts w:ascii="Times New Roman" w:eastAsia="Times New Roman" w:hAnsi="Times New Roman" w:cs="Times New Roman"/>
+                <w:kern w:val="0"/>
+                <w14:ligatures w14:val="none"/>
+              </w:rPr>
+              <w:t>Purview</w:t>
+            </w:r>
+          </w:p>
+        </w:tc>
+      </w:tr>
+    </w:tbl>
+    <w:p>
+      <w:pPr>
+        <w:spacing w:before="100" w:beforeAutospacing="1" w:after="100" w:afterAutospacing="1" w:line="240" w:lineRule="auto"/>
+        <w:rPr>
+          <w:rFonts w:ascii="Times New Roman" w:eastAsia="Times New Roman" w:hAnsi="Times New Roman" w:cs="Times New Roman"/>
+          <w:kern w:val="0"/>
+          <w14:ligatures w14:val="none"/>
+        </w:rPr>
+      </w:pPr>
+      <w:r>
+        <w:rPr>
+          <w:rFonts w:ascii="Times New Roman" w:eastAsia="Times New Roman" w:hAnsi="Times New Roman" w:cs="Times New Roman"/>
+          <w:kern w:val="0"/>
+          <w14:ligatures w14:val="none"/>
+        </w:rPr>
+        <w:t>For MediaWave at 100x scale, our recommendation would be AWS-based: S3 for storage (Parquet objects with lifecycle policies for cost control), EMR for Spark batch jobs (transient clusters terminating after each Airflow-triggered run), MSK for Kafka (managed multi-AZ broker cluster), and MWAA for orchestration. Estimated monthly cost at 100x scale: $4,000-6,000 for compute, $200-400 for storage (assuming Glacier transitions for landing zone after 90 days), and $300-500 for streaming. This is approximately 70% cheaper than running equivalent self-managed infrastructure on EC2 once operational labor costs are included.</w:t>
+      </w:r>
+    </w:p>
+    <w:p>
+      <w:pPr>
+        <w:spacing w:before="100" w:beforeAutospacing="1" w:after="100" w:afterAutospacing="1" w:line="240" w:lineRule="auto"/>
+        <w:outlineLvl w:val="4"/>
+        <w:rPr>
+          <w:rFonts w:ascii="Times New Roman" w:eastAsia="Times New Roman" w:hAnsi="Times New Roman" w:cs="Times New Roman"/>
+          <w:b/>
+          <w:bCs/>
+          <w:kern w:val="0"/>
+          <w:sz w:val="20"/>
+          <w:szCs w:val="20"/>
+          <w14:ligatures w14:val="none"/>
+        </w:rPr>
+      </w:pPr>
+      <w:r>
+        <w:rPr>
+          <w:rFonts w:ascii="Times New Roman" w:eastAsia="Times New Roman" w:hAnsi="Times New Roman" w:cs="Times New Roman"/>
+          <w:b/>
+          <w:bCs/>
+          <w:kern w:val="0"/>
+          <w:sz w:val="20"/>
+          <w:szCs w:val="20"/>
+          <w14:ligatures w14:val="none"/>
+        </w:rPr>
+        <w:t>5.3 Cost-Performance Trade-offs</w:t>
+      </w:r>
+    </w:p>
+    <w:p>
+      <w:pPr>
+        <w:spacing w:before="100" w:beforeAutospacing="1" w:after="100" w:afterAutospacing="1" w:line="240" w:lineRule="auto"/>
+        <w:rPr>
+          <w:rFonts w:ascii="Times New Roman" w:eastAsia="Times New Roman" w:hAnsi="Times New Roman" w:cs="Times New Roman"/>
+          <w:kern w:val="0"/>
+          <w14:ligatures w14:val="none"/>
+        </w:rPr>
+      </w:pPr>
+      <w:r>
+        <w:rPr>
+          <w:rFonts w:ascii="Times New Roman" w:eastAsia="Times New Roman" w:hAnsi="Times New Roman" w:cs="Times New Roman"/>
+          <w:kern w:val="0"/>
+          <w14:ligatures w14:val="none"/>
+        </w:rPr>
+        <w:lastRenderedPageBreak/>
+        <w:t>Three architecture decisions become tunable knobs at scale.</w:t>
+      </w:r>
+    </w:p>
+    <w:p>
+      <w:pPr>
+        <w:spacing w:before="100" w:beforeAutospacing="1" w:after="100" w:afterAutospacing="1" w:line="240" w:lineRule="auto"/>
+        <w:rPr>
+          <w:rFonts w:ascii="Times New Roman" w:eastAsia="Times New Roman" w:hAnsi="Times New Roman" w:cs="Times New Roman"/>
+          <w:kern w:val="0"/>
+          <w14:ligatures w14:val="none"/>
+        </w:rPr>
+      </w:pPr>
+      <w:r>
+        <w:rPr>
+          <w:rFonts w:ascii="Times New Roman" w:eastAsia="Times New Roman" w:hAnsi="Times New Roman" w:cs="Times New Roman"/>
+          <w:kern w:val="0"/>
+          <w14:ligatures w14:val="none"/>
+        </w:rPr>
+        <w:t>Replication factor trades storage cost for fault tolerance. RF=3 triples raw storage cost; RF=2 risks data loss on 2 simultaneous datanode failures.</w:t>
+      </w:r>
+    </w:p>
+    <w:p>
+      <w:pPr>
+        <w:spacing w:before="100" w:beforeAutospacing="1" w:after="100" w:afterAutospacing="1" w:line="240" w:lineRule="auto"/>
+        <w:rPr>
+          <w:rFonts w:ascii="Times New Roman" w:eastAsia="Times New Roman" w:hAnsi="Times New Roman" w:cs="Times New Roman"/>
+          <w:kern w:val="0"/>
+          <w14:ligatures w14:val="none"/>
+        </w:rPr>
+      </w:pPr>
+      <w:r>
+        <w:rPr>
+          <w:rFonts w:ascii="Times New Roman" w:eastAsia="Times New Roman" w:hAnsi="Times New Roman" w:cs="Times New Roman"/>
+          <w:kern w:val="0"/>
+          <w14:ligatures w14:val="none"/>
+        </w:rPr>
+        <w:t>Parquet partitioning granularity trades query performance for partition-count overhead. Daily partitions are usually optimal; hourly creates too many small files; weekly limits query selectivity.</w:t>
+      </w:r>
+    </w:p>
+    <w:p>
+      <w:pPr>
+        <w:spacing w:before="100" w:beforeAutospacing="1" w:after="100" w:afterAutospacing="1" w:line="240" w:lineRule="auto"/>
+        <w:rPr>
+          <w:rFonts w:ascii="Times New Roman" w:eastAsia="Times New Roman" w:hAnsi="Times New Roman" w:cs="Times New Roman"/>
+          <w:kern w:val="0"/>
+          <w14:ligatures w14:val="none"/>
+        </w:rPr>
+      </w:pPr>
+      <w:r>
+        <w:rPr>
+          <w:rFonts w:ascii="Times New Roman" w:eastAsia="Times New Roman" w:hAnsi="Times New Roman" w:cs="Times New Roman"/>
+          <w:kern w:val="0"/>
+          <w14:ligatures w14:val="none"/>
+        </w:rPr>
+        <w:t>Streaming window size trades latency for throughput. 1-minute tumbling windows give near-real-time alerts; 5-minute windows reduce processing load by 80% but mean alerts can be 5 minutes stale.</w:t>
+      </w:r>
+    </w:p>
+    <w:p>
+      <w:pPr>
+        <w:spacing w:before="100" w:beforeAutospacing="1" w:after="100" w:afterAutospacing="1" w:line="240" w:lineRule="auto"/>
+        <w:rPr>
+          <w:rFonts w:ascii="Times New Roman" w:eastAsia="Times New Roman" w:hAnsi="Times New Roman" w:cs="Times New Roman"/>
+          <w:kern w:val="0"/>
+          <w14:ligatures w14:val="none"/>
+        </w:rPr>
+      </w:pPr>
+      <w:r>
+        <w:rPr>
+          <w:rFonts w:ascii="Times New Roman" w:eastAsia="Times New Roman" w:hAnsi="Times New Roman" w:cs="Times New Roman"/>
+          <w:kern w:val="0"/>
+          <w14:ligatures w14:val="none"/>
+        </w:rPr>
+        <w:t>For MediaWave specifically, we recommend RF=3, daily partitions for time-series analytics (DAU, retention) and content_id partitions for catalog-based analytics (top performers), and 1-minute streaming windows for buffering alerts (where freshness matters) with 15-minute windows for content trends (where smoothness matters more than immediacy).</w:t>
+      </w:r>
+    </w:p>
     <w:sectPr>
       <w:pgSz w:w="12240" w:h="15840"/>
       <w:pgMar w:top="1440" w:right="1440" w:bottom="1440" w:left="1440" w:header="720" w:footer="720" w:gutter="0"/>
@@ -2931,7 +4790,6 @@
     <w:next w:val="Normal"/>
     <w:link w:val="Heading3Char"/>
     <w:uiPriority w:val="9"/>
-    <w:semiHidden/>
     <w:unhideWhenUsed/>
     <w:qFormat/>
     <w:rsid w:val="009C5E23"/>
@@ -3136,7 +4994,6 @@
     <w:basedOn w:val="DefaultParagraphFont"/>
     <w:link w:val="Heading3"/>
     <w:uiPriority w:val="9"/>
-    <w:semiHidden/>
     <w:rsid w:val="009C5E23"/>
     <w:rPr>
       <w:rFonts w:eastAsiaTheme="majorEastAsia" w:cstheme="majorBidi"/>

</xml_diff>